<commit_message>
feat: chay that Hadoop HDFS + Spark, nap 91.315 ban ghi va phan tich tren HDFS
- HDFS 3.4.1 pseudo-distributed chay that: 1 DataNode, 26 block, trang thai HEALTHY
- Doi phan vung tu NGAY sang THANG: 610 file vai chuc KB la small files problem
- Them setuptools vi PySpark 3.5.3 con dung distutils, da bo tu Python 3.12
- Bo sung ket qua chay that vao bao cao, ke ca bang doi chieu 2 nguon du lieu
</commit_message>
<xml_diff>
--- a/BaoCao_ECommerce_BigData.docx
+++ b/BaoCao_ECommerce_BigData.docx
@@ -6049,6 +6049,4389 @@
       </w:pPr>
       <w:r>
         <w:t>CHƯƠNG 4. XỬ LÝ VÀ PHÂN TÍCH DỮ LIỆU LỚN</w:t>
+      </w:r>
+    </w:p>
+    <w:p>
+      <w:pPr>
+        <w:pStyle w:val="Heading2"/>
+      </w:pPr>
+      <w:r>
+        <w:t>4A.1. Vì sao cần tầng Hadoop</w:t>
+      </w:r>
+    </w:p>
+    <w:p>
+      <w:pPr>
+        <w:jc w:val="both"/>
+      </w:pPr>
+      <w:r>
+        <w:t xml:space="preserve">Hai CSDL vận hành ở Chương 2 và 3 phục vụ </w:t>
+      </w:r>
+      <w:r>
+        <w:rPr>
+          <w:b/>
+        </w:rPr>
+        <w:t>giao dịch</w:t>
+      </w:r>
+      <w:r>
+        <w:t>: đọc ghi từng bản ghi, độ trễ thấp, luôn sẵn sàng. Chạy truy vấn phân tích quét toàn bộ bảng trực tiếp trên chúng sẽ giành tài nguyên với luồng bán hàng — giờ cao điểm mà chạy báo cáo doanh thu cả năm thì khách hàng chịu trận.</w:t>
+      </w:r>
+    </w:p>
+    <w:p>
+      <w:pPr>
+        <w:jc w:val="both"/>
+      </w:pPr>
+      <w:r>
+        <w:t>Kiến trúc chuẩn tách hai việc này:</w:t>
+      </w:r>
+    </w:p>
+    <w:p>
+      <w:pPr>
+        <w:spacing w:before="80"/>
+        <w:ind w:left="340"/>
+      </w:pPr>
+      <w:r>
+        <w:rPr>
+          <w:rFonts w:ascii="Consolas" w:hAnsi="Consolas"/>
+          <w:color w:val="1E293B"/>
+          <w:sz w:val="19"/>
+        </w:rPr>
+        <w:t xml:space="preserve">  Tầng vận hành (OLTP)              Tầng phân tích (OLAP)</w:t>
+        <w:br/>
+        <w:t xml:space="preserve">  ┌──────────────┐                  ┌─────────────────────────┐</w:t>
+        <w:br/>
+        <w:t xml:space="preserve">  │  SQL Server  │ ──┐              │                         │</w:t>
+        <w:br/>
+        <w:t xml:space="preserve">  └──────────────┘   │   Parquet    │   HDFS  ──►  Spark      │</w:t>
+        <w:br/>
+        <w:t xml:space="preserve">                     ├────────────► │   (lưu trữ) (tính toán) │</w:t>
+        <w:br/>
+        <w:t xml:space="preserve">  ┌──────────────┐   │              │                         │</w:t>
+        <w:br/>
+        <w:t xml:space="preserve">  │   MongoDB    │ ──┘              └─────────────────────────┘</w:t>
+        <w:br/>
+        <w:t xml:space="preserve">  └──────────────┘</w:t>
+      </w:r>
+    </w:p>
+    <w:p>
+      <w:pPr>
+        <w:pStyle w:val="Heading2"/>
+      </w:pPr>
+      <w:r>
+        <w:t>4A.2. Kiến trúc Hadoop đã triển khai</w:t>
+      </w:r>
+    </w:p>
+    <w:tbl>
+      <w:tblPr>
+        <w:tblStyle w:val="TableGrid"/>
+        <w:tblW w:type="auto" w:w="0"/>
+        <w:jc w:val="center"/>
+        <w:tblLook w:firstColumn="1" w:firstRow="1" w:lastColumn="0" w:lastRow="0" w:noHBand="0" w:noVBand="1" w:val="04A0"/>
+      </w:tblPr>
+      <w:tblGrid>
+        <w:gridCol w:w="3118"/>
+        <w:gridCol w:w="3118"/>
+        <w:gridCol w:w="3118"/>
+      </w:tblGrid>
+      <w:tr>
+        <w:tc>
+          <w:tcPr>
+            <w:tcW w:type="dxa" w:w="3118"/>
+            <w:shd w:val="clear" w:fill="FFE8E1"/>
+          </w:tcPr>
+          <w:p>
+            <w:r>
+              <w:rPr>
+                <w:b/>
+                <w:sz w:val="21"/>
+              </w:rPr>
+            </w:r>
+            <w:r>
+              <w:rPr>
+                <w:b/>
+                <w:sz w:val="21"/>
+              </w:rPr>
+              <w:t>Thành phần</w:t>
+            </w:r>
+          </w:p>
+        </w:tc>
+        <w:tc>
+          <w:tcPr>
+            <w:tcW w:type="dxa" w:w="3118"/>
+            <w:shd w:val="clear" w:fill="FFE8E1"/>
+          </w:tcPr>
+          <w:p>
+            <w:r>
+              <w:rPr>
+                <w:b/>
+                <w:sz w:val="21"/>
+              </w:rPr>
+            </w:r>
+            <w:r>
+              <w:rPr>
+                <w:b/>
+                <w:sz w:val="21"/>
+              </w:rPr>
+              <w:t>Vai trò</w:t>
+            </w:r>
+          </w:p>
+        </w:tc>
+        <w:tc>
+          <w:tcPr>
+            <w:tcW w:type="dxa" w:w="3118"/>
+            <w:shd w:val="clear" w:fill="FFE8E1"/>
+          </w:tcPr>
+          <w:p>
+            <w:r>
+              <w:rPr>
+                <w:b/>
+                <w:sz w:val="21"/>
+              </w:rPr>
+            </w:r>
+            <w:r>
+              <w:rPr>
+                <w:b/>
+                <w:sz w:val="21"/>
+              </w:rPr>
+              <w:t>Cấu hình trong đồ án</w:t>
+            </w:r>
+          </w:p>
+        </w:tc>
+      </w:tr>
+      <w:tr>
+        <w:tc>
+          <w:tcPr>
+            <w:tcW w:type="dxa" w:w="3118"/>
+          </w:tcPr>
+          <w:p>
+            <w:r>
+              <w:rPr>
+                <w:sz w:val="21"/>
+              </w:rPr>
+            </w:r>
+            <w:r>
+              <w:rPr>
+                <w:b/>
+                <w:sz w:val="21"/>
+              </w:rPr>
+              <w:t>NameNode</w:t>
+            </w:r>
+          </w:p>
+        </w:tc>
+        <w:tc>
+          <w:tcPr>
+            <w:tcW w:type="dxa" w:w="3118"/>
+          </w:tcPr>
+          <w:p>
+            <w:r>
+              <w:rPr>
+                <w:sz w:val="21"/>
+              </w:rPr>
+            </w:r>
+            <w:r>
+              <w:rPr>
+                <w:sz w:val="21"/>
+              </w:rPr>
+              <w:t>Giữ metadata: cây thư mục, tên file, khối nào nằm ở DataNode nào. Không giữ dữ liệu thật.</w:t>
+            </w:r>
+          </w:p>
+        </w:tc>
+        <w:tc>
+          <w:tcPr>
+            <w:tcW w:type="dxa" w:w="3118"/>
+          </w:tcPr>
+          <w:p>
+            <w:r>
+              <w:rPr>
+                <w:sz w:val="21"/>
+              </w:rPr>
+            </w:r>
+            <w:r>
+              <w:rPr>
+                <w:sz w:val="21"/>
+              </w:rPr>
+              <w:t>Cổng 9000 (RPC), 9870 (web UI)</w:t>
+            </w:r>
+          </w:p>
+        </w:tc>
+      </w:tr>
+      <w:tr>
+        <w:tc>
+          <w:tcPr>
+            <w:tcW w:type="dxa" w:w="3118"/>
+          </w:tcPr>
+          <w:p>
+            <w:r>
+              <w:rPr>
+                <w:sz w:val="21"/>
+              </w:rPr>
+            </w:r>
+            <w:r>
+              <w:rPr>
+                <w:b/>
+                <w:sz w:val="21"/>
+              </w:rPr>
+              <w:t>DataNode</w:t>
+            </w:r>
+          </w:p>
+        </w:tc>
+        <w:tc>
+          <w:tcPr>
+            <w:tcW w:type="dxa" w:w="3118"/>
+          </w:tcPr>
+          <w:p>
+            <w:r>
+              <w:rPr>
+                <w:sz w:val="21"/>
+              </w:rPr>
+            </w:r>
+            <w:r>
+              <w:rPr>
+                <w:sz w:val="21"/>
+              </w:rPr>
+              <w:t>Lưu các khối dữ liệu thật trên đĩa, báo cáo định kỳ về NameNode</w:t>
+            </w:r>
+          </w:p>
+        </w:tc>
+        <w:tc>
+          <w:tcPr>
+            <w:tcW w:type="dxa" w:w="3118"/>
+          </w:tcPr>
+          <w:p>
+            <w:r>
+              <w:rPr>
+                <w:sz w:val="21"/>
+              </w:rPr>
+            </w:r>
+            <w:r>
+              <w:rPr>
+                <w:sz w:val="21"/>
+              </w:rPr>
+              <w:t>1 node</w:t>
+            </w:r>
+          </w:p>
+        </w:tc>
+      </w:tr>
+      <w:tr>
+        <w:tc>
+          <w:tcPr>
+            <w:tcW w:type="dxa" w:w="3118"/>
+          </w:tcPr>
+          <w:p>
+            <w:r>
+              <w:rPr>
+                <w:sz w:val="21"/>
+              </w:rPr>
+            </w:r>
+            <w:r>
+              <w:rPr>
+                <w:b/>
+                <w:sz w:val="21"/>
+              </w:rPr>
+              <w:t>Spark</w:t>
+            </w:r>
+          </w:p>
+        </w:tc>
+        <w:tc>
+          <w:tcPr>
+            <w:tcW w:type="dxa" w:w="3118"/>
+          </w:tcPr>
+          <w:p>
+            <w:r>
+              <w:rPr>
+                <w:sz w:val="21"/>
+              </w:rPr>
+            </w:r>
+            <w:r>
+              <w:rPr>
+                <w:sz w:val="21"/>
+              </w:rPr>
+              <w:t>Lớp tính toán, đọc dữ liệu từ HDFS và xử lý song song</w:t>
+            </w:r>
+          </w:p>
+        </w:tc>
+        <w:tc>
+          <w:tcPr>
+            <w:tcW w:type="dxa" w:w="3118"/>
+          </w:tcPr>
+          <w:p>
+            <w:r>
+              <w:rPr>
+                <w:sz w:val="21"/>
+              </w:rPr>
+            </w:r>
+            <w:r>
+              <w:rPr>
+                <w:sz w:val="21"/>
+              </w:rPr>
+              <w:t xml:space="preserve">Chế độ </w:t>
+            </w:r>
+            <w:r>
+              <w:rPr>
+                <w:rFonts w:ascii="Consolas" w:hAnsi="Consolas"/>
+                <w:color w:val="EE4D2D"/>
+                <w:sz w:val="21"/>
+              </w:rPr>
+              <w:t>local[*]</w:t>
+            </w:r>
+          </w:p>
+        </w:tc>
+      </w:tr>
+    </w:tbl>
+    <w:p/>
+    <w:p>
+      <w:pPr>
+        <w:jc w:val="both"/>
+      </w:pPr>
+      <w:r>
+        <w:t xml:space="preserve">Hệ thống chạy ở </w:t>
+      </w:r>
+      <w:r>
+        <w:rPr>
+          <w:b/>
+        </w:rPr>
+        <w:t>chế độ pseudo-distributed</w:t>
+      </w:r>
+      <w:r>
+        <w:t>: một máy đóng cả hai vai trò NameNode và DataNode, nhưng các tiến trình vẫn tách biệt và giao tiếp qua RPC đúng như trong cụm thật. Khác biệt duy nhất so với cụm sản xuất là số máy.</w:t>
+      </w:r>
+    </w:p>
+    <w:p>
+      <w:pPr>
+        <w:pStyle w:val="Heading3"/>
+      </w:pPr>
+      <w:r>
+        <w:t>Hệ số nhân bản</w:t>
+      </w:r>
+    </w:p>
+    <w:p>
+      <w:pPr>
+        <w:jc w:val="both"/>
+      </w:pPr>
+      <w:r>
+        <w:t xml:space="preserve">Cấu hình </w:t>
+      </w:r>
+      <w:r>
+        <w:rPr>
+          <w:rFonts w:ascii="Consolas" w:hAnsi="Consolas"/>
+          <w:color w:val="EE4D2D"/>
+          <w:sz w:val="22"/>
+        </w:rPr>
+        <w:t>dfs.replication = 1</w:t>
+      </w:r>
+      <w:r>
+        <w:t xml:space="preserve"> vì chỉ có một DataNode. Trong cụm thật giá trị mặc định là </w:t>
+      </w:r>
+      <w:r>
+        <w:rPr>
+          <w:b/>
+        </w:rPr>
+        <w:t>3</w:t>
+      </w:r>
+      <w:r>
+        <w:t>: mỗi khối dữ liệu được lưu trên ba máy khác nhau, thường là hai máy cùng rack và một máy khác rack. Nhờ vậy hỏng một ổ cứng hay mất một rack đều không mất dữ liệu, và Spark có thể chọn bản sao gần nhất để đọc.</w:t>
+      </w:r>
+    </w:p>
+    <w:p>
+      <w:pPr>
+        <w:pStyle w:val="Heading3"/>
+      </w:pPr>
+      <w:r>
+        <w:t>Kích thước khối</w:t>
+      </w:r>
+    </w:p>
+    <w:p>
+      <w:pPr>
+        <w:jc w:val="both"/>
+      </w:pPr>
+      <w:r>
+        <w:t xml:space="preserve">Đặt </w:t>
+      </w:r>
+      <w:r>
+        <w:rPr>
+          <w:rFonts w:ascii="Consolas" w:hAnsi="Consolas"/>
+          <w:color w:val="EE4D2D"/>
+          <w:sz w:val="22"/>
+        </w:rPr>
+        <w:t>dfs.blocksize = 16 MB</w:t>
+      </w:r>
+      <w:r>
+        <w:t xml:space="preserve"> thay vì mặc định 128 MB, vì dữ liệu của đồ án chỉ vài chục MB — để mặc định thì mọi file đều gói gọn trong một khối và không quan sát được cơ chế chia khối. Trong thực tế khối lớn có lợi: ít metadata cho NameNode hơn, và mỗi tác vụ Spark xử lý được nhiều dữ liệu hơn trước khi phải đọc khối mới.</w:t>
+      </w:r>
+    </w:p>
+    <w:p>
+      <w:pPr>
+        <w:pStyle w:val="Heading2"/>
+      </w:pPr>
+      <w:r>
+        <w:t>4A.3. Định dạng Parquet</w:t>
+      </w:r>
+    </w:p>
+    <w:p>
+      <w:pPr>
+        <w:jc w:val="both"/>
+      </w:pPr>
+      <w:r>
+        <w:t xml:space="preserve">Dữ liệu được chuyển sang </w:t>
+      </w:r>
+      <w:r>
+        <w:rPr>
+          <w:b/>
+        </w:rPr>
+        <w:t>Apache Parquet</w:t>
+      </w:r>
+      <w:r>
+        <w:t xml:space="preserve"> trước khi đẩy lên HDFS, thay vì CSV hay JSON. Parquet là định dạng </w:t>
+      </w:r>
+      <w:r>
+        <w:rPr>
+          <w:b/>
+        </w:rPr>
+        <w:t>lưu theo cột</w:t>
+      </w:r>
+      <w:r>
+        <w:t>:</w:t>
+      </w:r>
+    </w:p>
+    <w:tbl>
+      <w:tblPr>
+        <w:tblStyle w:val="TableGrid"/>
+        <w:tblW w:type="auto" w:w="0"/>
+        <w:jc w:val="center"/>
+        <w:tblLook w:firstColumn="1" w:firstRow="1" w:lastColumn="0" w:lastRow="0" w:noHBand="0" w:noVBand="1" w:val="04A0"/>
+      </w:tblPr>
+      <w:tblGrid>
+        <w:gridCol w:w="3118"/>
+        <w:gridCol w:w="3118"/>
+        <w:gridCol w:w="3118"/>
+      </w:tblGrid>
+      <w:tr>
+        <w:tc>
+          <w:tcPr>
+            <w:tcW w:type="dxa" w:w="3118"/>
+            <w:shd w:val="clear" w:fill="FFE8E1"/>
+          </w:tcPr>
+          <w:p>
+            <w:r>
+              <w:rPr>
+                <w:b/>
+                <w:sz w:val="21"/>
+              </w:rPr>
+            </w:r>
+          </w:p>
+        </w:tc>
+        <w:tc>
+          <w:tcPr>
+            <w:tcW w:type="dxa" w:w="3118"/>
+            <w:shd w:val="clear" w:fill="FFE8E1"/>
+          </w:tcPr>
+          <w:p>
+            <w:r>
+              <w:rPr>
+                <w:b/>
+                <w:sz w:val="21"/>
+              </w:rPr>
+            </w:r>
+            <w:r>
+              <w:rPr>
+                <w:b/>
+                <w:sz w:val="21"/>
+              </w:rPr>
+              <w:t>CSV / JSON (theo dòng)</w:t>
+            </w:r>
+          </w:p>
+        </w:tc>
+        <w:tc>
+          <w:tcPr>
+            <w:tcW w:type="dxa" w:w="3118"/>
+            <w:shd w:val="clear" w:fill="FFE8E1"/>
+          </w:tcPr>
+          <w:p>
+            <w:r>
+              <w:rPr>
+                <w:b/>
+                <w:sz w:val="21"/>
+              </w:rPr>
+            </w:r>
+            <w:r>
+              <w:rPr>
+                <w:b/>
+                <w:sz w:val="21"/>
+              </w:rPr>
+              <w:t>Parquet (theo cột)</w:t>
+            </w:r>
+          </w:p>
+        </w:tc>
+      </w:tr>
+      <w:tr>
+        <w:tc>
+          <w:tcPr>
+            <w:tcW w:type="dxa" w:w="3118"/>
+          </w:tcPr>
+          <w:p>
+            <w:r>
+              <w:rPr>
+                <w:sz w:val="21"/>
+              </w:rPr>
+            </w:r>
+            <w:r>
+              <w:rPr>
+                <w:sz w:val="21"/>
+              </w:rPr>
+              <w:t>Đọc 2 cột trong bảng 20 cột</w:t>
+            </w:r>
+          </w:p>
+        </w:tc>
+        <w:tc>
+          <w:tcPr>
+            <w:tcW w:type="dxa" w:w="3118"/>
+          </w:tcPr>
+          <w:p>
+            <w:r>
+              <w:rPr>
+                <w:sz w:val="21"/>
+              </w:rPr>
+            </w:r>
+            <w:r>
+              <w:rPr>
+                <w:sz w:val="21"/>
+              </w:rPr>
+              <w:t>Phải đọc toàn bộ file</w:t>
+            </w:r>
+          </w:p>
+        </w:tc>
+        <w:tc>
+          <w:tcPr>
+            <w:tcW w:type="dxa" w:w="3118"/>
+          </w:tcPr>
+          <w:p>
+            <w:r>
+              <w:rPr>
+                <w:sz w:val="21"/>
+              </w:rPr>
+            </w:r>
+            <w:r>
+              <w:rPr>
+                <w:sz w:val="21"/>
+              </w:rPr>
+              <w:t>Chỉ đọc 2 cột đó</w:t>
+            </w:r>
+          </w:p>
+        </w:tc>
+      </w:tr>
+      <w:tr>
+        <w:tc>
+          <w:tcPr>
+            <w:tcW w:type="dxa" w:w="3118"/>
+          </w:tcPr>
+          <w:p>
+            <w:r>
+              <w:rPr>
+                <w:sz w:val="21"/>
+              </w:rPr>
+            </w:r>
+            <w:r>
+              <w:rPr>
+                <w:sz w:val="21"/>
+              </w:rPr>
+              <w:t>Tỷ lệ nén</w:t>
+            </w:r>
+          </w:p>
+        </w:tc>
+        <w:tc>
+          <w:tcPr>
+            <w:tcW w:type="dxa" w:w="3118"/>
+          </w:tcPr>
+          <w:p>
+            <w:r>
+              <w:rPr>
+                <w:sz w:val="21"/>
+              </w:rPr>
+            </w:r>
+            <w:r>
+              <w:rPr>
+                <w:sz w:val="21"/>
+              </w:rPr>
+              <w:t>Thấp</w:t>
+            </w:r>
+          </w:p>
+        </w:tc>
+        <w:tc>
+          <w:tcPr>
+            <w:tcW w:type="dxa" w:w="3118"/>
+          </w:tcPr>
+          <w:p>
+            <w:r>
+              <w:rPr>
+                <w:sz w:val="21"/>
+              </w:rPr>
+            </w:r>
+            <w:r>
+              <w:rPr>
+                <w:sz w:val="21"/>
+              </w:rPr>
+              <w:t>Cao — các giá trị cùng cột giống nhau nên nén rất tốt</w:t>
+            </w:r>
+          </w:p>
+        </w:tc>
+      </w:tr>
+      <w:tr>
+        <w:tc>
+          <w:tcPr>
+            <w:tcW w:type="dxa" w:w="3118"/>
+          </w:tcPr>
+          <w:p>
+            <w:r>
+              <w:rPr>
+                <w:sz w:val="21"/>
+              </w:rPr>
+            </w:r>
+            <w:r>
+              <w:rPr>
+                <w:sz w:val="21"/>
+              </w:rPr>
+              <w:t>Kiểu dữ liệu</w:t>
+            </w:r>
+          </w:p>
+        </w:tc>
+        <w:tc>
+          <w:tcPr>
+            <w:tcW w:type="dxa" w:w="3118"/>
+          </w:tcPr>
+          <w:p>
+            <w:r>
+              <w:rPr>
+                <w:sz w:val="21"/>
+              </w:rPr>
+            </w:r>
+            <w:r>
+              <w:rPr>
+                <w:sz w:val="21"/>
+              </w:rPr>
+              <w:t>Mất, phải tự đoán khi đọc</w:t>
+            </w:r>
+          </w:p>
+        </w:tc>
+        <w:tc>
+          <w:tcPr>
+            <w:tcW w:type="dxa" w:w="3118"/>
+          </w:tcPr>
+          <w:p>
+            <w:r>
+              <w:rPr>
+                <w:sz w:val="21"/>
+              </w:rPr>
+            </w:r>
+            <w:r>
+              <w:rPr>
+                <w:sz w:val="21"/>
+              </w:rPr>
+              <w:t>Lưu kèm trong file</w:t>
+            </w:r>
+          </w:p>
+        </w:tc>
+      </w:tr>
+      <w:tr>
+        <w:tc>
+          <w:tcPr>
+            <w:tcW w:type="dxa" w:w="3118"/>
+          </w:tcPr>
+          <w:p>
+            <w:r>
+              <w:rPr>
+                <w:sz w:val="21"/>
+              </w:rPr>
+            </w:r>
+            <w:r>
+              <w:rPr>
+                <w:sz w:val="21"/>
+              </w:rPr>
+              <w:t>Đẩy điều kiện lọc xuống tầng lưu trữ</w:t>
+            </w:r>
+          </w:p>
+        </w:tc>
+        <w:tc>
+          <w:tcPr>
+            <w:tcW w:type="dxa" w:w="3118"/>
+          </w:tcPr>
+          <w:p>
+            <w:r>
+              <w:rPr>
+                <w:sz w:val="21"/>
+              </w:rPr>
+            </w:r>
+            <w:r>
+              <w:rPr>
+                <w:sz w:val="21"/>
+              </w:rPr>
+              <w:t>Không</w:t>
+            </w:r>
+          </w:p>
+        </w:tc>
+        <w:tc>
+          <w:tcPr>
+            <w:tcW w:type="dxa" w:w="3118"/>
+          </w:tcPr>
+          <w:p>
+            <w:r>
+              <w:rPr>
+                <w:sz w:val="21"/>
+              </w:rPr>
+            </w:r>
+            <w:r>
+              <w:rPr>
+                <w:sz w:val="21"/>
+              </w:rPr>
+              <w:t>Có (predicate pushdown)</w:t>
+            </w:r>
+          </w:p>
+        </w:tc>
+      </w:tr>
+    </w:tbl>
+    <w:p/>
+    <w:p>
+      <w:pPr>
+        <w:pStyle w:val="Heading2"/>
+      </w:pPr>
+      <w:r>
+        <w:t>4A.4. Tổ chức dữ liệu trên HDFS</w:t>
+      </w:r>
+    </w:p>
+    <w:p>
+      <w:pPr>
+        <w:spacing w:before="80"/>
+        <w:ind w:left="340"/>
+      </w:pPr>
+      <w:r>
+        <w:rPr>
+          <w:rFonts w:ascii="Consolas" w:hAnsi="Consolas"/>
+          <w:color w:val="1E293B"/>
+          <w:sz w:val="19"/>
+        </w:rPr>
+        <w:t>/ecommerce</w:t>
+        <w:br/>
+        <w:t>├── raw/                          ← dữ liệu thô vừa trích xuất</w:t>
+        <w:br/>
+        <w:t>│   ├── dim_product.parquet</w:t>
+        <w:br/>
+        <w:t>│   ├── dim_customer.parquet</w:t>
+        <w:br/>
+        <w:t>│   ├── fact_order_line.parquet</w:t>
+        <w:br/>
+        <w:t>│   ├── fact_shipment.parquet</w:t>
+        <w:br/>
+        <w:t>│   ├── shipment_scans.parquet</w:t>
+        <w:br/>
+        <w:t>│   └── clickstream_events/       ← phân vùng theo tháng</w:t>
+        <w:br/>
+        <w:t>│       ├── event_month=2025-01/</w:t>
+        <w:br/>
+        <w:t>│       ├── event_month=2025-02/</w:t>
+        <w:br/>
+        <w:t>│       └── ...</w:t>
+        <w:br/>
+        <w:t>└── curated/                      ← kết quả sau khi Spark xử lý</w:t>
+        <w:br/>
+        <w:t xml:space="preserve">    ├── san_pham_gop_hai_nguon/</w:t>
+        <w:br/>
+        <w:t xml:space="preserve">    ├── pheu_chuyen_doi/</w:t>
+        <w:br/>
+        <w:t xml:space="preserve">    └── ...</w:t>
+      </w:r>
+    </w:p>
+    <w:p>
+      <w:pPr>
+        <w:jc w:val="both"/>
+      </w:pPr>
+      <w:r>
+        <w:rPr>
+          <w:b/>
+        </w:rPr>
+        <w:t>Phân vùng (partitioning)</w:t>
+      </w:r>
+      <w:r>
+        <w:t xml:space="preserve"> là kỹ thuật quan trọng nhất ở đây. Thư mục </w:t>
+      </w:r>
+      <w:r>
+        <w:rPr>
+          <w:rFonts w:ascii="Consolas" w:hAnsi="Consolas"/>
+          <w:color w:val="EE4D2D"/>
+          <w:sz w:val="22"/>
+        </w:rPr>
+        <w:t>clickstream_events</w:t>
+      </w:r>
+      <w:r>
+        <w:t xml:space="preserve"> được chia theo </w:t>
+      </w:r>
+      <w:r>
+        <w:rPr>
+          <w:rFonts w:ascii="Consolas" w:hAnsi="Consolas"/>
+          <w:color w:val="EE4D2D"/>
+          <w:sz w:val="22"/>
+        </w:rPr>
+        <w:t>event_month</w:t>
+      </w:r>
+      <w:r>
+        <w:t xml:space="preserve">. Khi Spark chạy truy vấn có điều kiện </w:t>
+      </w:r>
+      <w:r>
+        <w:rPr>
+          <w:rFonts w:ascii="Consolas" w:hAnsi="Consolas"/>
+          <w:color w:val="EE4D2D"/>
+          <w:sz w:val="22"/>
+        </w:rPr>
+        <w:t>WHERE event_month &gt;= '2026-01'</w:t>
+      </w:r>
+      <w:r>
+        <w:t xml:space="preserve">, nó </w:t>
+      </w:r>
+      <w:r>
+        <w:rPr>
+          <w:b/>
+        </w:rPr>
+        <w:t>bỏ qua hoàn toàn</w:t>
+      </w:r>
+      <w:r>
+        <w:t xml:space="preserve"> các thư mục không thỏa mãn thay vì đọc rồi lọc — gọi là </w:t>
+      </w:r>
+      <w:r>
+        <w:rPr>
+          <w:i/>
+        </w:rPr>
+        <w:t>partition pruning</w:t>
+      </w:r>
+      <w:r>
+        <w:t>. Với dữ liệu hàng tỷ dòng, đây là khác biệt giữa vài giây và vài giờ.</w:t>
+      </w:r>
+    </w:p>
+    <w:p>
+      <w:pPr>
+        <w:pStyle w:val="Heading3"/>
+      </w:pPr>
+      <w:r>
+        <w:t>Chọn độ mịn của phân vùng</w:t>
+      </w:r>
+    </w:p>
+    <w:p>
+      <w:pPr>
+        <w:jc w:val="both"/>
+      </w:pPr>
+      <w:r>
+        <w:t xml:space="preserve">Bản cài đặt đầu tiên phân vùng theo </w:t>
+      </w:r>
+      <w:r>
+        <w:rPr>
+          <w:b/>
+        </w:rPr>
+        <w:t>ngày</w:t>
+      </w:r>
+      <w:r>
+        <w:t xml:space="preserve">. Dữ liệu trải 20 tháng nên sinh ra 610 thư mục, mỗi thư mục chỉ chứa một file vài chục KB. Đây chính là </w:t>
+      </w:r>
+      <w:r>
+        <w:rPr>
+          <w:b/>
+        </w:rPr>
+        <w:t>"small files problem"</w:t>
+      </w:r>
+      <w:r>
+        <w:t xml:space="preserve"> kinh điển của HDFS:</w:t>
+      </w:r>
+    </w:p>
+    <w:p>
+      <w:pPr>
+        <w:pStyle w:val="ListBullet"/>
+      </w:pPr>
+      <w:r>
+        <w:t xml:space="preserve">NameNode giữ metadata của </w:t>
+      </w:r>
+      <w:r>
+        <w:rPr>
+          <w:b/>
+        </w:rPr>
+        <w:t>mọi</w:t>
+      </w:r>
+      <w:r>
+        <w:t xml:space="preserve"> file và khối trong RAM. Hàng triệu file nhỏ làm</w:t>
+      </w:r>
+    </w:p>
+    <w:p>
+      <w:pPr>
+        <w:jc w:val="both"/>
+      </w:pPr>
+      <w:r>
+        <w:t>NameNode hết bộ nhớ, dù tổng dung lượng dữ liệu không lớn.</w:t>
+      </w:r>
+    </w:p>
+    <w:p>
+      <w:pPr>
+        <w:pStyle w:val="ListBullet"/>
+      </w:pPr>
+      <w:r>
+        <w:t>Mỗi file dù chỉ 30 KB vẫn chiếm một khối riêng về mặt metadata.</w:t>
+      </w:r>
+    </w:p>
+    <w:p>
+      <w:pPr>
+        <w:pStyle w:val="ListBullet"/>
+      </w:pPr>
+      <w:r>
+        <w:t>Spark phải mở 610 file thay vì vài file lớn, chi phí mở file lấn át chi phí đọc.</w:t>
+      </w:r>
+    </w:p>
+    <w:p>
+      <w:pPr>
+        <w:jc w:val="both"/>
+      </w:pPr>
+      <w:r>
+        <w:t xml:space="preserve">Vì vậy bản cuối chuyển sang phân vùng theo </w:t>
+      </w:r>
+      <w:r>
+        <w:rPr>
+          <w:b/>
+        </w:rPr>
+        <w:t>tháng</w:t>
+      </w:r>
+      <w:r>
+        <w:t xml:space="preserve"> — 20 phân vùng. Quy tắc thực tế trong sản xuất: mỗi phân vùng nên đạt từ 128 MB trở lên, tức bằng đúng một khối HDFS.</w:t>
+      </w:r>
+    </w:p>
+    <w:p>
+      <w:pPr>
+        <w:jc w:val="both"/>
+      </w:pPr>
+      <w:r>
+        <w:t xml:space="preserve">Hai lớp </w:t>
+      </w:r>
+      <w:r>
+        <w:rPr>
+          <w:rFonts w:ascii="Consolas" w:hAnsi="Consolas"/>
+          <w:color w:val="EE4D2D"/>
+          <w:sz w:val="22"/>
+        </w:rPr>
+        <w:t>raw</w:t>
+      </w:r>
+      <w:r>
+        <w:t xml:space="preserve"> và </w:t>
+      </w:r>
+      <w:r>
+        <w:rPr>
+          <w:rFonts w:ascii="Consolas" w:hAnsi="Consolas"/>
+          <w:color w:val="EE4D2D"/>
+          <w:sz w:val="22"/>
+        </w:rPr>
+        <w:t>curated</w:t>
+      </w:r>
+      <w:r>
+        <w:t xml:space="preserve"> phản ánh mô hình </w:t>
+      </w:r>
+      <w:r>
+        <w:rPr>
+          <w:b/>
+        </w:rPr>
+        <w:t>data lake</w:t>
+      </w:r>
+      <w:r>
+        <w:t xml:space="preserve"> phổ biến: lớp thô giữ nguyên dữ liệu gốc để có thể tính lại khi logic thay đổi; lớp tinh chứa kết quả đã tổng hợp, sẵn sàng cho báo cáo.</w:t>
+      </w:r>
+    </w:p>
+    <w:p>
+      <w:pPr>
+        <w:pStyle w:val="Heading2"/>
+      </w:pPr>
+      <w:r>
+        <w:t>4A.5. Quy trình chạy</w:t>
+      </w:r>
+    </w:p>
+    <w:p>
+      <w:pPr>
+        <w:spacing w:before="80"/>
+        <w:ind w:left="340"/>
+      </w:pPr>
+      <w:r>
+        <w:rPr>
+          <w:rFonts w:ascii="Consolas" w:hAnsi="Consolas"/>
+          <w:color w:val="1E293B"/>
+          <w:sz w:val="19"/>
+        </w:rPr>
+        <w:t>./scripts/install_hadoop.sh                        # cài Hadoop 3.4.1 (một lần)</w:t>
+        <w:br/>
+        <w:t>./scripts/start_hdfs.sh                            # khởi động NameNode + DataNode</w:t>
+        <w:br/>
+        <w:t>uv run python -m ecommerce_bigdata.hdfs_ingest     # trích xuất → Parquet → HDFS</w:t>
+        <w:br/>
+        <w:t>uv run python -m ecommerce_bigdata.spark_analytics # Spark đọc từ HDFS và phân tích</w:t>
+      </w:r>
+    </w:p>
+    <w:p>
+      <w:pPr>
+        <w:jc w:val="both"/>
+      </w:pPr>
+      <w:r>
+        <w:t xml:space="preserve">Giao diện web của NameNode tại </w:t>
+      </w:r>
+      <w:r>
+        <w:rPr>
+          <w:rFonts w:ascii="Consolas" w:hAnsi="Consolas"/>
+          <w:color w:val="EE4D2D"/>
+          <w:sz w:val="22"/>
+        </w:rPr>
+        <w:t>http://127.0.0.1:9870</w:t>
+      </w:r>
+      <w:r>
+        <w:t xml:space="preserve"> cho phép duyệt cây thư mục HDFS, xem số khối của từng file và tình trạng DataNode — dùng để minh họa khi demo.</w:t>
+      </w:r>
+    </w:p>
+    <w:p>
+      <w:pPr>
+        <w:pStyle w:val="Heading2"/>
+      </w:pPr>
+      <w:r>
+        <w:t>4A.6. Kết quả chạy thực tế</w:t>
+      </w:r>
+    </w:p>
+    <w:p>
+      <w:pPr>
+        <w:jc w:val="both"/>
+      </w:pPr>
+      <w:r>
+        <w:t>Cụm HDFS đã chạy và nạp dữ liệu thành công:</w:t>
+      </w:r>
+    </w:p>
+    <w:tbl>
+      <w:tblPr>
+        <w:tblStyle w:val="TableGrid"/>
+        <w:tblW w:type="auto" w:w="0"/>
+        <w:jc w:val="center"/>
+        <w:tblLook w:firstColumn="1" w:firstRow="1" w:lastColumn="0" w:lastRow="0" w:noHBand="0" w:noVBand="1" w:val="04A0"/>
+      </w:tblPr>
+      <w:tblGrid>
+        <w:gridCol w:w="4677"/>
+        <w:gridCol w:w="4677"/>
+      </w:tblGrid>
+      <w:tr>
+        <w:tc>
+          <w:tcPr>
+            <w:tcW w:type="dxa" w:w="4677"/>
+            <w:shd w:val="clear" w:fill="FFE8E1"/>
+          </w:tcPr>
+          <w:p>
+            <w:r>
+              <w:rPr>
+                <w:b/>
+                <w:sz w:val="21"/>
+              </w:rPr>
+            </w:r>
+            <w:r>
+              <w:rPr>
+                <w:b/>
+                <w:sz w:val="21"/>
+              </w:rPr>
+              <w:t>Chỉ số</w:t>
+            </w:r>
+          </w:p>
+        </w:tc>
+        <w:tc>
+          <w:tcPr>
+            <w:tcW w:type="dxa" w:w="4677"/>
+            <w:shd w:val="clear" w:fill="FFE8E1"/>
+          </w:tcPr>
+          <w:p>
+            <w:r>
+              <w:rPr>
+                <w:b/>
+                <w:sz w:val="21"/>
+              </w:rPr>
+            </w:r>
+            <w:r>
+              <w:rPr>
+                <w:b/>
+                <w:sz w:val="21"/>
+              </w:rPr>
+              <w:t>Giá trị</w:t>
+            </w:r>
+          </w:p>
+        </w:tc>
+      </w:tr>
+      <w:tr>
+        <w:tc>
+          <w:tcPr>
+            <w:tcW w:type="dxa" w:w="4677"/>
+          </w:tcPr>
+          <w:p>
+            <w:r>
+              <w:rPr>
+                <w:sz w:val="21"/>
+              </w:rPr>
+            </w:r>
+            <w:r>
+              <w:rPr>
+                <w:sz w:val="21"/>
+              </w:rPr>
+              <w:t>Phiên bản Hadoop</w:t>
+            </w:r>
+          </w:p>
+        </w:tc>
+        <w:tc>
+          <w:tcPr>
+            <w:tcW w:type="dxa" w:w="4677"/>
+          </w:tcPr>
+          <w:p>
+            <w:r>
+              <w:rPr>
+                <w:sz w:val="21"/>
+              </w:rPr>
+            </w:r>
+            <w:r>
+              <w:rPr>
+                <w:sz w:val="21"/>
+              </w:rPr>
+              <w:t>3.4.1</w:t>
+            </w:r>
+          </w:p>
+        </w:tc>
+      </w:tr>
+      <w:tr>
+        <w:tc>
+          <w:tcPr>
+            <w:tcW w:type="dxa" w:w="4677"/>
+          </w:tcPr>
+          <w:p>
+            <w:r>
+              <w:rPr>
+                <w:sz w:val="21"/>
+              </w:rPr>
+            </w:r>
+            <w:r>
+              <w:rPr>
+                <w:sz w:val="21"/>
+              </w:rPr>
+              <w:t>Số DataNode hoạt động</w:t>
+            </w:r>
+          </w:p>
+        </w:tc>
+        <w:tc>
+          <w:tcPr>
+            <w:tcW w:type="dxa" w:w="4677"/>
+          </w:tcPr>
+          <w:p>
+            <w:r>
+              <w:rPr>
+                <w:sz w:val="21"/>
+              </w:rPr>
+            </w:r>
+            <w:r>
+              <w:rPr>
+                <w:sz w:val="21"/>
+              </w:rPr>
+              <w:t>1</w:t>
+            </w:r>
+          </w:p>
+        </w:tc>
+      </w:tr>
+      <w:tr>
+        <w:tc>
+          <w:tcPr>
+            <w:tcW w:type="dxa" w:w="4677"/>
+          </w:tcPr>
+          <w:p>
+            <w:r>
+              <w:rPr>
+                <w:sz w:val="21"/>
+              </w:rPr>
+            </w:r>
+            <w:r>
+              <w:rPr>
+                <w:sz w:val="21"/>
+              </w:rPr>
+              <w:t>Tổng bản ghi đã nạp</w:t>
+            </w:r>
+          </w:p>
+        </w:tc>
+        <w:tc>
+          <w:tcPr>
+            <w:tcW w:type="dxa" w:w="4677"/>
+          </w:tcPr>
+          <w:p>
+            <w:r>
+              <w:rPr>
+                <w:sz w:val="21"/>
+              </w:rPr>
+            </w:r>
+            <w:r>
+              <w:rPr>
+                <w:sz w:val="21"/>
+              </w:rPr>
+              <w:t>91.315</w:t>
+            </w:r>
+          </w:p>
+        </w:tc>
+      </w:tr>
+      <w:tr>
+        <w:tc>
+          <w:tcPr>
+            <w:tcW w:type="dxa" w:w="4677"/>
+          </w:tcPr>
+          <w:p>
+            <w:r>
+              <w:rPr>
+                <w:sz w:val="21"/>
+              </w:rPr>
+            </w:r>
+            <w:r>
+              <w:rPr>
+                <w:sz w:val="21"/>
+              </w:rPr>
+              <w:t xml:space="preserve">Số file trên </w:t>
+            </w:r>
+            <w:r>
+              <w:rPr>
+                <w:rFonts w:ascii="Consolas" w:hAnsi="Consolas"/>
+                <w:color w:val="EE4D2D"/>
+                <w:sz w:val="21"/>
+              </w:rPr>
+              <w:t>/ecommerce/raw</w:t>
+            </w:r>
+          </w:p>
+        </w:tc>
+        <w:tc>
+          <w:tcPr>
+            <w:tcW w:type="dxa" w:w="4677"/>
+          </w:tcPr>
+          <w:p>
+            <w:r>
+              <w:rPr>
+                <w:sz w:val="21"/>
+              </w:rPr>
+            </w:r>
+            <w:r>
+              <w:rPr>
+                <w:sz w:val="21"/>
+              </w:rPr>
+              <w:t>26</w:t>
+            </w:r>
+          </w:p>
+        </w:tc>
+      </w:tr>
+      <w:tr>
+        <w:tc>
+          <w:tcPr>
+            <w:tcW w:type="dxa" w:w="4677"/>
+          </w:tcPr>
+          <w:p>
+            <w:r>
+              <w:rPr>
+                <w:sz w:val="21"/>
+              </w:rPr>
+            </w:r>
+            <w:r>
+              <w:rPr>
+                <w:sz w:val="21"/>
+              </w:rPr>
+              <w:t>Số khối (block)</w:t>
+            </w:r>
+          </w:p>
+        </w:tc>
+        <w:tc>
+          <w:tcPr>
+            <w:tcW w:type="dxa" w:w="4677"/>
+          </w:tcPr>
+          <w:p>
+            <w:r>
+              <w:rPr>
+                <w:sz w:val="21"/>
+              </w:rPr>
+            </w:r>
+            <w:r>
+              <w:rPr>
+                <w:sz w:val="21"/>
+              </w:rPr>
+              <w:t>26</w:t>
+            </w:r>
+          </w:p>
+        </w:tc>
+      </w:tr>
+      <w:tr>
+        <w:tc>
+          <w:tcPr>
+            <w:tcW w:type="dxa" w:w="4677"/>
+          </w:tcPr>
+          <w:p>
+            <w:r>
+              <w:rPr>
+                <w:sz w:val="21"/>
+              </w:rPr>
+            </w:r>
+            <w:r>
+              <w:rPr>
+                <w:sz w:val="21"/>
+              </w:rPr>
+              <w:t>Kích thước khối trung bình</w:t>
+            </w:r>
+          </w:p>
+        </w:tc>
+        <w:tc>
+          <w:tcPr>
+            <w:tcW w:type="dxa" w:w="4677"/>
+          </w:tcPr>
+          <w:p>
+            <w:r>
+              <w:rPr>
+                <w:sz w:val="21"/>
+              </w:rPr>
+            </w:r>
+            <w:r>
+              <w:rPr>
+                <w:sz w:val="21"/>
+              </w:rPr>
+              <w:t>178 KB</w:t>
+            </w:r>
+          </w:p>
+        </w:tc>
+      </w:tr>
+      <w:tr>
+        <w:tc>
+          <w:tcPr>
+            <w:tcW w:type="dxa" w:w="4677"/>
+          </w:tcPr>
+          <w:p>
+            <w:r>
+              <w:rPr>
+                <w:sz w:val="21"/>
+              </w:rPr>
+            </w:r>
+            <w:r>
+              <w:rPr>
+                <w:sz w:val="21"/>
+              </w:rPr>
+              <w:t>Hệ số nhân bản</w:t>
+            </w:r>
+          </w:p>
+        </w:tc>
+        <w:tc>
+          <w:tcPr>
+            <w:tcW w:type="dxa" w:w="4677"/>
+          </w:tcPr>
+          <w:p>
+            <w:r>
+              <w:rPr>
+                <w:sz w:val="21"/>
+              </w:rPr>
+            </w:r>
+            <w:r>
+              <w:rPr>
+                <w:sz w:val="21"/>
+              </w:rPr>
+              <w:t>1</w:t>
+            </w:r>
+          </w:p>
+        </w:tc>
+      </w:tr>
+      <w:tr>
+        <w:tc>
+          <w:tcPr>
+            <w:tcW w:type="dxa" w:w="4677"/>
+          </w:tcPr>
+          <w:p>
+            <w:r>
+              <w:rPr>
+                <w:sz w:val="21"/>
+              </w:rPr>
+            </w:r>
+            <w:r>
+              <w:rPr>
+                <w:sz w:val="21"/>
+              </w:rPr>
+              <w:t xml:space="preserve">Dung lượng lớp </w:t>
+            </w:r>
+            <w:r>
+              <w:rPr>
+                <w:rFonts w:ascii="Consolas" w:hAnsi="Consolas"/>
+                <w:color w:val="EE4D2D"/>
+                <w:sz w:val="21"/>
+              </w:rPr>
+              <w:t>raw</w:t>
+            </w:r>
+          </w:p>
+        </w:tc>
+        <w:tc>
+          <w:tcPr>
+            <w:tcW w:type="dxa" w:w="4677"/>
+          </w:tcPr>
+          <w:p>
+            <w:r>
+              <w:rPr>
+                <w:sz w:val="21"/>
+              </w:rPr>
+            </w:r>
+            <w:r>
+              <w:rPr>
+                <w:sz w:val="21"/>
+              </w:rPr>
+              <w:t>4,4 MB</w:t>
+            </w:r>
+          </w:p>
+        </w:tc>
+      </w:tr>
+      <w:tr>
+        <w:tc>
+          <w:tcPr>
+            <w:tcW w:type="dxa" w:w="4677"/>
+          </w:tcPr>
+          <w:p>
+            <w:r>
+              <w:rPr>
+                <w:sz w:val="21"/>
+              </w:rPr>
+            </w:r>
+            <w:r>
+              <w:rPr>
+                <w:sz w:val="21"/>
+              </w:rPr>
+              <w:t xml:space="preserve">Dung lượng lớp </w:t>
+            </w:r>
+            <w:r>
+              <w:rPr>
+                <w:rFonts w:ascii="Consolas" w:hAnsi="Consolas"/>
+                <w:color w:val="EE4D2D"/>
+                <w:sz w:val="21"/>
+              </w:rPr>
+              <w:t>curated</w:t>
+            </w:r>
+          </w:p>
+        </w:tc>
+        <w:tc>
+          <w:tcPr>
+            <w:tcW w:type="dxa" w:w="4677"/>
+          </w:tcPr>
+          <w:p>
+            <w:r>
+              <w:rPr>
+                <w:sz w:val="21"/>
+              </w:rPr>
+            </w:r>
+            <w:r>
+              <w:rPr>
+                <w:sz w:val="21"/>
+              </w:rPr>
+              <w:t>30,6 KB</w:t>
+            </w:r>
+          </w:p>
+        </w:tc>
+      </w:tr>
+      <w:tr>
+        <w:tc>
+          <w:tcPr>
+            <w:tcW w:type="dxa" w:w="4677"/>
+          </w:tcPr>
+          <w:p>
+            <w:r>
+              <w:rPr>
+                <w:sz w:val="21"/>
+              </w:rPr>
+            </w:r>
+            <w:r>
+              <w:rPr>
+                <w:sz w:val="21"/>
+              </w:rPr>
+              <w:t>Trạng thái hệ thống tệp</w:t>
+            </w:r>
+          </w:p>
+        </w:tc>
+        <w:tc>
+          <w:tcPr>
+            <w:tcW w:type="dxa" w:w="4677"/>
+          </w:tcPr>
+          <w:p>
+            <w:r>
+              <w:rPr>
+                <w:sz w:val="21"/>
+              </w:rPr>
+            </w:r>
+            <w:r>
+              <w:rPr>
+                <w:rFonts w:ascii="Consolas" w:hAnsi="Consolas"/>
+                <w:color w:val="EE4D2D"/>
+                <w:sz w:val="21"/>
+              </w:rPr>
+              <w:t>HEALTHY</w:t>
+            </w:r>
+          </w:p>
+        </w:tc>
+      </w:tr>
+    </w:tbl>
+    <w:p/>
+    <w:p>
+      <w:pPr>
+        <w:jc w:val="both"/>
+      </w:pPr>
+      <w:r>
+        <w:t xml:space="preserve">Đáng chú ý: 91.315 bản ghi từ hai CSDL chỉ chiếm </w:t>
+      </w:r>
+      <w:r>
+        <w:rPr>
+          <w:b/>
+        </w:rPr>
+        <w:t>4,4 MB</w:t>
+      </w:r>
+      <w:r>
+        <w:t xml:space="preserve"> ở định dạng Parquet nén Snappy. Cùng lượng dữ liệu đó xuất ra CSV sẽ lớn gấp nhiều lần — minh chứng cho hiệu quả nén của định dạng lưu theo cột.</w:t>
+      </w:r>
+    </w:p>
+    <w:p>
+      <w:r>
+        <w:br w:type="page"/>
+      </w:r>
+    </w:p>
+    <w:p>
+      <w:pPr>
+        <w:pStyle w:val="Heading2"/>
+      </w:pPr>
+      <w:r>
+        <w:t>4B.1. Vì sao dùng Spark thay vì MapReduce</w:t>
+      </w:r>
+    </w:p>
+    <w:p>
+      <w:pPr>
+        <w:jc w:val="both"/>
+      </w:pPr>
+      <w:r>
+        <w:t xml:space="preserve">MapReduce là cơ chế xử lý nguyên thủy của Hadoop. Mỗi bước Map và Reduce đều </w:t>
+      </w:r>
+      <w:r>
+        <w:rPr>
+          <w:b/>
+        </w:rPr>
+        <w:t>ghi kết quả trung gian xuống đĩa</w:t>
+      </w:r>
+      <w:r>
+        <w:t xml:space="preserve">, nên một truy vấn nhiều bước phải đọc ghi đĩa rất nhiều lần. Spark giữ dữ liệu trung gian </w:t>
+      </w:r>
+      <w:r>
+        <w:rPr>
+          <w:b/>
+        </w:rPr>
+        <w:t>trong bộ nhớ</w:t>
+      </w:r>
+      <w:r>
+        <w:t>, do đó nhanh hơn đáng kể với các phép lặp và truy vấn nhiều tầng — đây là lý do Spark gần như thay thế hoàn toàn MapReduce trong thực tế, dù vẫn chạy trên cùng nền HDFS.</w:t>
+      </w:r>
+    </w:p>
+    <w:p>
+      <w:pPr>
+        <w:pStyle w:val="Heading2"/>
+      </w:pPr>
+      <w:r>
+        <w:t>4B.2. Mô hình xử lý</w:t>
+      </w:r>
+    </w:p>
+    <w:p>
+      <w:pPr>
+        <w:jc w:val="both"/>
+      </w:pPr>
+      <w:r>
+        <w:t xml:space="preserve">Spark chia dữ liệu thành </w:t>
+      </w:r>
+      <w:r>
+        <w:rPr>
+          <w:b/>
+        </w:rPr>
+        <w:t>phân vùng (partition)</w:t>
+      </w:r>
+      <w:r>
+        <w:t xml:space="preserve">, mỗi phân vùng được một luồng xử lý độc lập. Trong đồ án, Spark chạy ở chế độ </w:t>
+      </w:r>
+      <w:r>
+        <w:rPr>
+          <w:rFonts w:ascii="Consolas" w:hAnsi="Consolas"/>
+          <w:color w:val="EE4D2D"/>
+          <w:sz w:val="22"/>
+        </w:rPr>
+        <w:t>local[*]</w:t>
+      </w:r>
+      <w:r>
+        <w:t xml:space="preserve"> — một tiến trình JVM, mỗi lõi CPU đóng vai một executor. Cùng đoạn mã đó, chỉ cần đổi </w:t>
+      </w:r>
+      <w:r>
+        <w:rPr>
+          <w:rFonts w:ascii="Consolas" w:hAnsi="Consolas"/>
+          <w:color w:val="EE4D2D"/>
+          <w:sz w:val="22"/>
+        </w:rPr>
+        <w:t>--master</w:t>
+      </w:r>
+      <w:r>
+        <w:t xml:space="preserve"> sang địa chỉ của YARN hay Spark Standalone là chạy được trên cụm hàng trăm máy mà </w:t>
+      </w:r>
+      <w:r>
+        <w:rPr>
+          <w:b/>
+        </w:rPr>
+        <w:t>không sửa một dòng logic nào</w:t>
+      </w:r>
+      <w:r>
+        <w:t>. Đây chính là giá trị của mô hình lập trình phân tán.</w:t>
+      </w:r>
+    </w:p>
+    <w:p>
+      <w:pPr>
+        <w:jc w:val="both"/>
+      </w:pPr>
+      <w:r>
+        <w:t xml:space="preserve">Hai đặc điểm cần nhớ khi đọc mã nguồn </w:t>
+      </w:r>
+      <w:r>
+        <w:rPr>
+          <w:rFonts w:ascii="Consolas" w:hAnsi="Consolas"/>
+          <w:color w:val="EE4D2D"/>
+          <w:sz w:val="22"/>
+        </w:rPr>
+        <w:t>spark_analytics.py</w:t>
+      </w:r>
+      <w:r>
+        <w:t>:</w:t>
+      </w:r>
+    </w:p>
+    <w:p>
+      <w:pPr>
+        <w:pStyle w:val="ListBullet"/>
+      </w:pPr>
+      <w:r>
+        <w:rPr>
+          <w:b/>
+        </w:rPr>
+        <w:t>Tính toán lười (lazy evaluation).</w:t>
+      </w:r>
+      <w:r>
+        <w:t xml:space="preserve"> Các phép </w:t>
+      </w:r>
+      <w:r>
+        <w:rPr>
+          <w:rFonts w:ascii="Consolas" w:hAnsi="Consolas"/>
+          <w:color w:val="EE4D2D"/>
+          <w:sz w:val="22"/>
+        </w:rPr>
+        <w:t>filter</w:t>
+      </w:r>
+      <w:r>
+        <w:t xml:space="preserve">, </w:t>
+      </w:r>
+      <w:r>
+        <w:rPr>
+          <w:rFonts w:ascii="Consolas" w:hAnsi="Consolas"/>
+          <w:color w:val="EE4D2D"/>
+          <w:sz w:val="22"/>
+        </w:rPr>
+        <w:t>join</w:t>
+      </w:r>
+      <w:r>
+        <w:t xml:space="preserve">, </w:t>
+      </w:r>
+      <w:r>
+        <w:rPr>
+          <w:rFonts w:ascii="Consolas" w:hAnsi="Consolas"/>
+          <w:color w:val="EE4D2D"/>
+          <w:sz w:val="22"/>
+        </w:rPr>
+        <w:t>groupBy</w:t>
+      </w:r>
+      <w:r>
+        <w:t xml:space="preserve"> chỉ dựng</w:t>
+      </w:r>
+    </w:p>
+    <w:p>
+      <w:pPr>
+        <w:jc w:val="both"/>
+      </w:pPr>
+      <w:r>
+        <w:t xml:space="preserve">kế hoạch thực thi chứ chưa chạy. Spark chỉ thật sự tính khi gặp một </w:t>
+      </w:r>
+      <w:r>
+        <w:rPr>
+          <w:i/>
+        </w:rPr>
+        <w:t>action</w:t>
+      </w:r>
+      <w:r>
+        <w:t xml:space="preserve"> như </w:t>
+      </w:r>
+      <w:r>
+        <w:rPr>
+          <w:rFonts w:ascii="Consolas" w:hAnsi="Consolas"/>
+          <w:color w:val="EE4D2D"/>
+          <w:sz w:val="22"/>
+        </w:rPr>
+        <w:t>count()</w:t>
+      </w:r>
+      <w:r>
+        <w:t xml:space="preserve">, </w:t>
+      </w:r>
+      <w:r>
+        <w:rPr>
+          <w:rFonts w:ascii="Consolas" w:hAnsi="Consolas"/>
+          <w:color w:val="EE4D2D"/>
+          <w:sz w:val="22"/>
+        </w:rPr>
+        <w:t>show()</w:t>
+      </w:r>
+      <w:r>
+        <w:t xml:space="preserve"> hay </w:t>
+      </w:r>
+      <w:r>
+        <w:rPr>
+          <w:rFonts w:ascii="Consolas" w:hAnsi="Consolas"/>
+          <w:color w:val="EE4D2D"/>
+          <w:sz w:val="22"/>
+        </w:rPr>
+        <w:t>write()</w:t>
+      </w:r>
+      <w:r>
+        <w:t>. Nhờ vậy nó tối ưu được toàn bộ chuỗi phép biến đổi trước khi chạy — ví dụ tự đẩy điều kiện lọc xuống sát tầng đọc file.</w:t>
+      </w:r>
+    </w:p>
+    <w:p>
+      <w:pPr>
+        <w:pStyle w:val="ListBullet"/>
+      </w:pPr>
+      <w:r>
+        <w:rPr>
+          <w:b/>
+        </w:rPr>
+        <w:t>Bộ nhớ đệm (`cache`).</w:t>
+      </w:r>
+      <w:r>
+        <w:t xml:space="preserve"> DataFrame </w:t>
+      </w:r>
+      <w:r>
+        <w:rPr>
+          <w:rFonts w:ascii="Consolas" w:hAnsi="Consolas"/>
+          <w:color w:val="EE4D2D"/>
+          <w:sz w:val="22"/>
+        </w:rPr>
+        <w:t>events</w:t>
+      </w:r>
+      <w:r>
+        <w:t xml:space="preserve"> được dùng lại ở bốn phép tính khác</w:t>
+      </w:r>
+    </w:p>
+    <w:p>
+      <w:pPr>
+        <w:jc w:val="both"/>
+      </w:pPr>
+      <w:r>
+        <w:t xml:space="preserve">nhau. Không có </w:t>
+      </w:r>
+      <w:r>
+        <w:rPr>
+          <w:rFonts w:ascii="Consolas" w:hAnsi="Consolas"/>
+          <w:color w:val="EE4D2D"/>
+          <w:sz w:val="22"/>
+        </w:rPr>
+        <w:t>cache()</w:t>
+      </w:r>
+      <w:r>
+        <w:t xml:space="preserve">, Spark sẽ đọc lại từ HDFS bốn lần. Gọi </w:t>
+      </w:r>
+      <w:r>
+        <w:rPr>
+          <w:rFonts w:ascii="Consolas" w:hAnsi="Consolas"/>
+          <w:color w:val="EE4D2D"/>
+          <w:sz w:val="22"/>
+        </w:rPr>
+        <w:t>cache()</w:t>
+      </w:r>
+      <w:r>
+        <w:t xml:space="preserve"> giữ nó trong RAM sau lần tính đầu tiên.</w:t>
+      </w:r>
+    </w:p>
+    <w:p>
+      <w:pPr>
+        <w:pStyle w:val="Heading2"/>
+      </w:pPr>
+      <w:r>
+        <w:t>4B.3. Các phép phân tích đã cài đặt</w:t>
+      </w:r>
+    </w:p>
+    <w:tbl>
+      <w:tblPr>
+        <w:tblStyle w:val="TableGrid"/>
+        <w:tblW w:type="auto" w:w="0"/>
+        <w:jc w:val="center"/>
+        <w:tblLook w:firstColumn="1" w:firstRow="1" w:lastColumn="0" w:lastRow="0" w:noHBand="0" w:noVBand="1" w:val="04A0"/>
+      </w:tblPr>
+      <w:tblGrid>
+        <w:gridCol w:w="3118"/>
+        <w:gridCol w:w="3118"/>
+        <w:gridCol w:w="3118"/>
+      </w:tblGrid>
+      <w:tr>
+        <w:tc>
+          <w:tcPr>
+            <w:tcW w:type="dxa" w:w="3118"/>
+            <w:shd w:val="clear" w:fill="FFE8E1"/>
+          </w:tcPr>
+          <w:p>
+            <w:r>
+              <w:rPr>
+                <w:b/>
+                <w:sz w:val="21"/>
+              </w:rPr>
+            </w:r>
+            <w:r>
+              <w:rPr>
+                <w:b/>
+                <w:sz w:val="21"/>
+              </w:rPr>
+              <w:t>Hàm</w:t>
+            </w:r>
+          </w:p>
+        </w:tc>
+        <w:tc>
+          <w:tcPr>
+            <w:tcW w:type="dxa" w:w="3118"/>
+            <w:shd w:val="clear" w:fill="FFE8E1"/>
+          </w:tcPr>
+          <w:p>
+            <w:r>
+              <w:rPr>
+                <w:b/>
+                <w:sz w:val="21"/>
+              </w:rPr>
+            </w:r>
+            <w:r>
+              <w:rPr>
+                <w:b/>
+                <w:sz w:val="21"/>
+              </w:rPr>
+              <w:t>Nội dung</w:t>
+            </w:r>
+          </w:p>
+        </w:tc>
+        <w:tc>
+          <w:tcPr>
+            <w:tcW w:type="dxa" w:w="3118"/>
+            <w:shd w:val="clear" w:fill="FFE8E1"/>
+          </w:tcPr>
+          <w:p>
+            <w:r>
+              <w:rPr>
+                <w:b/>
+                <w:sz w:val="21"/>
+              </w:rPr>
+            </w:r>
+            <w:r>
+              <w:rPr>
+                <w:b/>
+                <w:sz w:val="21"/>
+              </w:rPr>
+              <w:t>Kỹ thuật Spark</w:t>
+            </w:r>
+          </w:p>
+        </w:tc>
+      </w:tr>
+      <w:tr>
+        <w:tc>
+          <w:tcPr>
+            <w:tcW w:type="dxa" w:w="3118"/>
+          </w:tcPr>
+          <w:p>
+            <w:r>
+              <w:rPr>
+                <w:sz w:val="21"/>
+              </w:rPr>
+            </w:r>
+            <w:r>
+              <w:rPr>
+                <w:rFonts w:ascii="Consolas" w:hAnsi="Consolas"/>
+                <w:color w:val="EE4D2D"/>
+                <w:sz w:val="21"/>
+              </w:rPr>
+              <w:t>phan_tich_san_pham</w:t>
+            </w:r>
+          </w:p>
+        </w:tc>
+        <w:tc>
+          <w:tcPr>
+            <w:tcW w:type="dxa" w:w="3118"/>
+          </w:tcPr>
+          <w:p>
+            <w:r>
+              <w:rPr>
+                <w:sz w:val="21"/>
+              </w:rPr>
+            </w:r>
+            <w:r>
+              <w:rPr>
+                <w:sz w:val="21"/>
+              </w:rPr>
+              <w:t xml:space="preserve">Gộp doanh thu (PostgreSQL) với lượt xem, lượt thêm giỏ (MongoDB) trên </w:t>
+            </w:r>
+            <w:r>
+              <w:rPr>
+                <w:rFonts w:ascii="Consolas" w:hAnsi="Consolas"/>
+                <w:color w:val="EE4D2D"/>
+                <w:sz w:val="21"/>
+              </w:rPr>
+              <w:t>product_id</w:t>
+            </w:r>
+          </w:p>
+        </w:tc>
+        <w:tc>
+          <w:tcPr>
+            <w:tcW w:type="dxa" w:w="3118"/>
+          </w:tcPr>
+          <w:p>
+            <w:r>
+              <w:rPr>
+                <w:sz w:val="21"/>
+              </w:rPr>
+            </w:r>
+            <w:r>
+              <w:rPr>
+                <w:rFonts w:ascii="Consolas" w:hAnsi="Consolas"/>
+                <w:color w:val="EE4D2D"/>
+                <w:sz w:val="21"/>
+              </w:rPr>
+              <w:t>join</w:t>
+            </w:r>
+            <w:r>
+              <w:rPr>
+                <w:sz w:val="21"/>
+              </w:rPr>
+              <w:t xml:space="preserve">, </w:t>
+            </w:r>
+            <w:r>
+              <w:rPr>
+                <w:rFonts w:ascii="Consolas" w:hAnsi="Consolas"/>
+                <w:color w:val="EE4D2D"/>
+                <w:sz w:val="21"/>
+              </w:rPr>
+              <w:t>pivot</w:t>
+            </w:r>
+            <w:r>
+              <w:rPr>
+                <w:sz w:val="21"/>
+              </w:rPr>
+              <w:t xml:space="preserve">, </w:t>
+            </w:r>
+            <w:r>
+              <w:rPr>
+                <w:rFonts w:ascii="Consolas" w:hAnsi="Consolas"/>
+                <w:color w:val="EE4D2D"/>
+                <w:sz w:val="21"/>
+              </w:rPr>
+              <w:t>groupBy</w:t>
+            </w:r>
+          </w:p>
+        </w:tc>
+      </w:tr>
+      <w:tr>
+        <w:tc>
+          <w:tcPr>
+            <w:tcW w:type="dxa" w:w="3118"/>
+          </w:tcPr>
+          <w:p>
+            <w:r>
+              <w:rPr>
+                <w:sz w:val="21"/>
+              </w:rPr>
+            </w:r>
+            <w:r>
+              <w:rPr>
+                <w:rFonts w:ascii="Consolas" w:hAnsi="Consolas"/>
+                <w:color w:val="EE4D2D"/>
+                <w:sz w:val="21"/>
+              </w:rPr>
+              <w:t>pheu_chuyen_doi</w:t>
+            </w:r>
+          </w:p>
+        </w:tc>
+        <w:tc>
+          <w:tcPr>
+            <w:tcW w:type="dxa" w:w="3118"/>
+          </w:tcPr>
+          <w:p>
+            <w:r>
+              <w:rPr>
+                <w:sz w:val="21"/>
+              </w:rPr>
+            </w:r>
+            <w:r>
+              <w:rPr>
+                <w:sz w:val="21"/>
+              </w:rPr>
+              <w:t>Đếm số phiên duy nhất ở từng bước của phễu</w:t>
+            </w:r>
+          </w:p>
+        </w:tc>
+        <w:tc>
+          <w:tcPr>
+            <w:tcW w:type="dxa" w:w="3118"/>
+          </w:tcPr>
+          <w:p>
+            <w:r>
+              <w:rPr>
+                <w:sz w:val="21"/>
+              </w:rPr>
+            </w:r>
+            <w:r>
+              <w:rPr>
+                <w:rFonts w:ascii="Consolas" w:hAnsi="Consolas"/>
+                <w:color w:val="EE4D2D"/>
+                <w:sz w:val="21"/>
+              </w:rPr>
+              <w:t>countDistinct</w:t>
+            </w:r>
+            <w:r>
+              <w:rPr>
+                <w:sz w:val="21"/>
+              </w:rPr>
+              <w:t xml:space="preserve">, </w:t>
+            </w:r>
+            <w:r>
+              <w:rPr>
+                <w:rFonts w:ascii="Consolas" w:hAnsi="Consolas"/>
+                <w:color w:val="EE4D2D"/>
+                <w:sz w:val="21"/>
+              </w:rPr>
+              <w:t>when/otherwise</w:t>
+            </w:r>
+          </w:p>
+        </w:tc>
+      </w:tr>
+      <w:tr>
+        <w:tc>
+          <w:tcPr>
+            <w:tcW w:type="dxa" w:w="3118"/>
+          </w:tcPr>
+          <w:p>
+            <w:r>
+              <w:rPr>
+                <w:sz w:val="21"/>
+              </w:rPr>
+            </w:r>
+            <w:r>
+              <w:rPr>
+                <w:rFonts w:ascii="Consolas" w:hAnsi="Consolas"/>
+                <w:color w:val="EE4D2D"/>
+                <w:sz w:val="21"/>
+              </w:rPr>
+              <w:t>doanh_thu_theo_thang</w:t>
+            </w:r>
+          </w:p>
+        </w:tc>
+        <w:tc>
+          <w:tcPr>
+            <w:tcW w:type="dxa" w:w="3118"/>
+          </w:tcPr>
+          <w:p>
+            <w:r>
+              <w:rPr>
+                <w:sz w:val="21"/>
+              </w:rPr>
+            </w:r>
+            <w:r>
+              <w:rPr>
+                <w:sz w:val="21"/>
+              </w:rPr>
+              <w:t>Doanh thu theo tháng và danh mục</w:t>
+            </w:r>
+          </w:p>
+        </w:tc>
+        <w:tc>
+          <w:tcPr>
+            <w:tcW w:type="dxa" w:w="3118"/>
+          </w:tcPr>
+          <w:p>
+            <w:r>
+              <w:rPr>
+                <w:sz w:val="21"/>
+              </w:rPr>
+            </w:r>
+            <w:r>
+              <w:rPr>
+                <w:rFonts w:ascii="Consolas" w:hAnsi="Consolas"/>
+                <w:color w:val="EE4D2D"/>
+                <w:sz w:val="21"/>
+              </w:rPr>
+              <w:t>date_format</w:t>
+            </w:r>
+            <w:r>
+              <w:rPr>
+                <w:sz w:val="21"/>
+              </w:rPr>
+              <w:t xml:space="preserve">, </w:t>
+            </w:r>
+            <w:r>
+              <w:rPr>
+                <w:rFonts w:ascii="Consolas" w:hAnsi="Consolas"/>
+                <w:color w:val="EE4D2D"/>
+                <w:sz w:val="21"/>
+              </w:rPr>
+              <w:t>groupBy</w:t>
+            </w:r>
+            <w:r>
+              <w:rPr>
+                <w:sz w:val="21"/>
+              </w:rPr>
+              <w:t xml:space="preserve"> nhiều khóa</w:t>
+            </w:r>
+          </w:p>
+        </w:tc>
+      </w:tr>
+      <w:tr>
+        <w:tc>
+          <w:tcPr>
+            <w:tcW w:type="dxa" w:w="3118"/>
+          </w:tcPr>
+          <w:p>
+            <w:r>
+              <w:rPr>
+                <w:sz w:val="21"/>
+              </w:rPr>
+            </w:r>
+            <w:r>
+              <w:rPr>
+                <w:rFonts w:ascii="Consolas" w:hAnsi="Consolas"/>
+                <w:color w:val="EE4D2D"/>
+                <w:sz w:val="21"/>
+              </w:rPr>
+              <w:t>hieu_suat_van_chuyen</w:t>
+            </w:r>
+          </w:p>
+        </w:tc>
+        <w:tc>
+          <w:tcPr>
+            <w:tcW w:type="dxa" w:w="3118"/>
+          </w:tcPr>
+          <w:p>
+            <w:r>
+              <w:rPr>
+                <w:sz w:val="21"/>
+              </w:rPr>
+            </w:r>
+            <w:r>
+              <w:rPr>
+                <w:sz w:val="21"/>
+              </w:rPr>
+              <w:t xml:space="preserve">Gộp bảng </w:t>
+            </w:r>
+            <w:r>
+              <w:rPr>
+                <w:rFonts w:ascii="Consolas" w:hAnsi="Consolas"/>
+                <w:color w:val="EE4D2D"/>
+                <w:sz w:val="21"/>
+              </w:rPr>
+              <w:t>Shipment</w:t>
+            </w:r>
+            <w:r>
+              <w:rPr>
+                <w:sz w:val="21"/>
+              </w:rPr>
+              <w:t xml:space="preserve"> với log quét mã vạch trên </w:t>
+            </w:r>
+            <w:r>
+              <w:rPr>
+                <w:rFonts w:ascii="Consolas" w:hAnsi="Consolas"/>
+                <w:color w:val="EE4D2D"/>
+                <w:sz w:val="21"/>
+              </w:rPr>
+              <w:t>tracking_no</w:t>
+            </w:r>
+          </w:p>
+        </w:tc>
+        <w:tc>
+          <w:tcPr>
+            <w:tcW w:type="dxa" w:w="3118"/>
+          </w:tcPr>
+          <w:p>
+            <w:r>
+              <w:rPr>
+                <w:sz w:val="21"/>
+              </w:rPr>
+            </w:r>
+            <w:r>
+              <w:rPr>
+                <w:rFonts w:ascii="Consolas" w:hAnsi="Consolas"/>
+                <w:color w:val="EE4D2D"/>
+                <w:sz w:val="21"/>
+              </w:rPr>
+              <w:t>join</w:t>
+            </w:r>
+            <w:r>
+              <w:rPr>
+                <w:sz w:val="21"/>
+              </w:rPr>
+              <w:t xml:space="preserve">, </w:t>
+            </w:r>
+            <w:r>
+              <w:rPr>
+                <w:rFonts w:ascii="Consolas" w:hAnsi="Consolas"/>
+                <w:color w:val="EE4D2D"/>
+                <w:sz w:val="21"/>
+              </w:rPr>
+              <w:t>percentile_approx</w:t>
+            </w:r>
+          </w:p>
+        </w:tc>
+      </w:tr>
+      <w:tr>
+        <w:tc>
+          <w:tcPr>
+            <w:tcW w:type="dxa" w:w="3118"/>
+          </w:tcPr>
+          <w:p>
+            <w:r>
+              <w:rPr>
+                <w:sz w:val="21"/>
+              </w:rPr>
+            </w:r>
+            <w:r>
+              <w:rPr>
+                <w:rFonts w:ascii="Consolas" w:hAnsi="Consolas"/>
+                <w:color w:val="EE4D2D"/>
+                <w:sz w:val="21"/>
+              </w:rPr>
+              <w:t>top_san_pham_moi_danh_muc</w:t>
+            </w:r>
+          </w:p>
+        </w:tc>
+        <w:tc>
+          <w:tcPr>
+            <w:tcW w:type="dxa" w:w="3118"/>
+          </w:tcPr>
+          <w:p>
+            <w:r>
+              <w:rPr>
+                <w:sz w:val="21"/>
+              </w:rPr>
+            </w:r>
+            <w:r>
+              <w:rPr>
+                <w:sz w:val="21"/>
+              </w:rPr>
+              <w:t>Ba sản phẩm doanh thu cao nhất trong mỗi danh mục</w:t>
+            </w:r>
+          </w:p>
+        </w:tc>
+        <w:tc>
+          <w:tcPr>
+            <w:tcW w:type="dxa" w:w="3118"/>
+          </w:tcPr>
+          <w:p>
+            <w:r>
+              <w:rPr>
+                <w:sz w:val="21"/>
+              </w:rPr>
+            </w:r>
+            <w:r>
+              <w:rPr>
+                <w:b/>
+                <w:sz w:val="21"/>
+              </w:rPr>
+              <w:t>Hàm cửa sổ</w:t>
+            </w:r>
+            <w:r>
+              <w:rPr>
+                <w:sz w:val="21"/>
+              </w:rPr>
+              <w:t xml:space="preserve"> </w:t>
+            </w:r>
+            <w:r>
+              <w:rPr>
+                <w:rFonts w:ascii="Consolas" w:hAnsi="Consolas"/>
+                <w:color w:val="EE4D2D"/>
+                <w:sz w:val="21"/>
+              </w:rPr>
+              <w:t>row_number() OVER (PARTITION BY ...)</w:t>
+            </w:r>
+          </w:p>
+        </w:tc>
+      </w:tr>
+      <w:tr>
+        <w:tc>
+          <w:tcPr>
+            <w:tcW w:type="dxa" w:w="3118"/>
+          </w:tcPr>
+          <w:p>
+            <w:r>
+              <w:rPr>
+                <w:sz w:val="21"/>
+              </w:rPr>
+            </w:r>
+            <w:r>
+              <w:rPr>
+                <w:rFonts w:ascii="Consolas" w:hAnsi="Consolas"/>
+                <w:color w:val="EE4D2D"/>
+                <w:sz w:val="21"/>
+              </w:rPr>
+              <w:t>gio_cao_diem</w:t>
+            </w:r>
+          </w:p>
+        </w:tc>
+        <w:tc>
+          <w:tcPr>
+            <w:tcW w:type="dxa" w:w="3118"/>
+          </w:tcPr>
+          <w:p>
+            <w:r>
+              <w:rPr>
+                <w:sz w:val="21"/>
+              </w:rPr>
+            </w:r>
+            <w:r>
+              <w:rPr>
+                <w:sz w:val="21"/>
+              </w:rPr>
+              <w:t>Phân bố sự kiện theo giờ và nền tảng</w:t>
+            </w:r>
+          </w:p>
+        </w:tc>
+        <w:tc>
+          <w:tcPr>
+            <w:tcW w:type="dxa" w:w="3118"/>
+          </w:tcPr>
+          <w:p>
+            <w:r>
+              <w:rPr>
+                <w:sz w:val="21"/>
+              </w:rPr>
+            </w:r>
+            <w:r>
+              <w:rPr>
+                <w:rFonts w:ascii="Consolas" w:hAnsi="Consolas"/>
+                <w:color w:val="EE4D2D"/>
+                <w:sz w:val="21"/>
+              </w:rPr>
+              <w:t>hour()</w:t>
+            </w:r>
+            <w:r>
+              <w:rPr>
+                <w:sz w:val="21"/>
+              </w:rPr>
+              <w:t xml:space="preserve">, </w:t>
+            </w:r>
+            <w:r>
+              <w:rPr>
+                <w:rFonts w:ascii="Consolas" w:hAnsi="Consolas"/>
+                <w:color w:val="EE4D2D"/>
+                <w:sz w:val="21"/>
+              </w:rPr>
+              <w:t>groupBy</w:t>
+            </w:r>
+          </w:p>
+        </w:tc>
+      </w:tr>
+    </w:tbl>
+    <w:p/>
+    <w:p>
+      <w:pPr>
+        <w:jc w:val="both"/>
+      </w:pPr>
+      <w:r>
+        <w:t xml:space="preserve">Phép gộp ở hàng đầu tiên là trọng tâm của đề bài: nó </w:t>
+      </w:r>
+      <w:r>
+        <w:rPr>
+          <w:b/>
+        </w:rPr>
+        <w:t>đối chiếu dữ liệu danh mục từ CSDL quan hệ với dữ liệu log từ NoSQL</w:t>
+      </w:r>
+      <w:r>
+        <w:t>, nhưng thực hiện trên HDFS bằng Spark thay vì trong bộ nhớ một tiến trình.</w:t>
+      </w:r>
+    </w:p>
+    <w:p>
+      <w:pPr>
+        <w:pStyle w:val="Heading2"/>
+      </w:pPr>
+      <w:r>
+        <w:t>4B.4. So sánh hai cách làm trong đồ án</w:t>
+      </w:r>
+    </w:p>
+    <w:p>
+      <w:pPr>
+        <w:jc w:val="both"/>
+      </w:pPr>
+      <w:r>
+        <w:t xml:space="preserve">Đồ án cài đặt </w:t>
+      </w:r>
+      <w:r>
+        <w:rPr>
+          <w:b/>
+        </w:rPr>
+        <w:t>hai phiên bản</w:t>
+      </w:r>
+      <w:r>
+        <w:t xml:space="preserve"> của cùng bài toán phân tích để so sánh:</w:t>
+      </w:r>
+    </w:p>
+    <w:tbl>
+      <w:tblPr>
+        <w:tblStyle w:val="TableGrid"/>
+        <w:tblW w:type="auto" w:w="0"/>
+        <w:jc w:val="center"/>
+        <w:tblLook w:firstColumn="1" w:firstRow="1" w:lastColumn="0" w:lastRow="0" w:noHBand="0" w:noVBand="1" w:val="04A0"/>
+      </w:tblPr>
+      <w:tblGrid>
+        <w:gridCol w:w="3118"/>
+        <w:gridCol w:w="3118"/>
+        <w:gridCol w:w="3118"/>
+      </w:tblGrid>
+      <w:tr>
+        <w:tc>
+          <w:tcPr>
+            <w:tcW w:type="dxa" w:w="3118"/>
+            <w:shd w:val="clear" w:fill="FFE8E1"/>
+          </w:tcPr>
+          <w:p>
+            <w:r>
+              <w:rPr>
+                <w:b/>
+                <w:sz w:val="21"/>
+              </w:rPr>
+            </w:r>
+          </w:p>
+        </w:tc>
+        <w:tc>
+          <w:tcPr>
+            <w:tcW w:type="dxa" w:w="3118"/>
+            <w:shd w:val="clear" w:fill="FFE8E1"/>
+          </w:tcPr>
+          <w:p>
+            <w:r>
+              <w:rPr>
+                <w:b/>
+                <w:sz w:val="21"/>
+              </w:rPr>
+            </w:r>
+            <w:r>
+              <w:rPr>
+                <w:rFonts w:ascii="Consolas" w:hAnsi="Consolas"/>
+                <w:b/>
+                <w:color w:val="EE4D2D"/>
+                <w:sz w:val="21"/>
+              </w:rPr>
+              <w:t>analytics.py</w:t>
+            </w:r>
+            <w:r>
+              <w:rPr>
+                <w:b/>
+                <w:sz w:val="21"/>
+              </w:rPr>
+              <w:t xml:space="preserve"> (pandas)</w:t>
+            </w:r>
+          </w:p>
+        </w:tc>
+        <w:tc>
+          <w:tcPr>
+            <w:tcW w:type="dxa" w:w="3118"/>
+            <w:shd w:val="clear" w:fill="FFE8E1"/>
+          </w:tcPr>
+          <w:p>
+            <w:r>
+              <w:rPr>
+                <w:b/>
+                <w:sz w:val="21"/>
+              </w:rPr>
+            </w:r>
+            <w:r>
+              <w:rPr>
+                <w:rFonts w:ascii="Consolas" w:hAnsi="Consolas"/>
+                <w:b/>
+                <w:color w:val="EE4D2D"/>
+                <w:sz w:val="21"/>
+              </w:rPr>
+              <w:t>spark_analytics.py</w:t>
+            </w:r>
+            <w:r>
+              <w:rPr>
+                <w:b/>
+                <w:sz w:val="21"/>
+              </w:rPr>
+              <w:t xml:space="preserve"> (Spark + HDFS)</w:t>
+            </w:r>
+          </w:p>
+        </w:tc>
+      </w:tr>
+      <w:tr>
+        <w:tc>
+          <w:tcPr>
+            <w:tcW w:type="dxa" w:w="3118"/>
+          </w:tcPr>
+          <w:p>
+            <w:r>
+              <w:rPr>
+                <w:sz w:val="21"/>
+              </w:rPr>
+            </w:r>
+            <w:r>
+              <w:rPr>
+                <w:sz w:val="21"/>
+              </w:rPr>
+              <w:t>Nguồn đọc</w:t>
+            </w:r>
+          </w:p>
+        </w:tc>
+        <w:tc>
+          <w:tcPr>
+            <w:tcW w:type="dxa" w:w="3118"/>
+          </w:tcPr>
+          <w:p>
+            <w:r>
+              <w:rPr>
+                <w:sz w:val="21"/>
+              </w:rPr>
+            </w:r>
+            <w:r>
+              <w:rPr>
+                <w:sz w:val="21"/>
+              </w:rPr>
+              <w:t>Trực tiếp PostgreSQL và MongoDB</w:t>
+            </w:r>
+          </w:p>
+        </w:tc>
+        <w:tc>
+          <w:tcPr>
+            <w:tcW w:type="dxa" w:w="3118"/>
+          </w:tcPr>
+          <w:p>
+            <w:r>
+              <w:rPr>
+                <w:sz w:val="21"/>
+              </w:rPr>
+            </w:r>
+            <w:r>
+              <w:rPr>
+                <w:sz w:val="21"/>
+              </w:rPr>
+              <w:t>Parquet trên HDFS</w:t>
+            </w:r>
+          </w:p>
+        </w:tc>
+      </w:tr>
+      <w:tr>
+        <w:tc>
+          <w:tcPr>
+            <w:tcW w:type="dxa" w:w="3118"/>
+          </w:tcPr>
+          <w:p>
+            <w:r>
+              <w:rPr>
+                <w:sz w:val="21"/>
+              </w:rPr>
+            </w:r>
+            <w:r>
+              <w:rPr>
+                <w:sz w:val="21"/>
+              </w:rPr>
+              <w:t>Nơi xử lý</w:t>
+            </w:r>
+          </w:p>
+        </w:tc>
+        <w:tc>
+          <w:tcPr>
+            <w:tcW w:type="dxa" w:w="3118"/>
+          </w:tcPr>
+          <w:p>
+            <w:r>
+              <w:rPr>
+                <w:sz w:val="21"/>
+              </w:rPr>
+            </w:r>
+            <w:r>
+              <w:rPr>
+                <w:sz w:val="21"/>
+              </w:rPr>
+              <w:t>Bộ nhớ của một tiến trình</w:t>
+            </w:r>
+          </w:p>
+        </w:tc>
+        <w:tc>
+          <w:tcPr>
+            <w:tcW w:type="dxa" w:w="3118"/>
+          </w:tcPr>
+          <w:p>
+            <w:r>
+              <w:rPr>
+                <w:sz w:val="21"/>
+              </w:rPr>
+            </w:r>
+            <w:r>
+              <w:rPr>
+                <w:sz w:val="21"/>
+              </w:rPr>
+              <w:t>Phân tán trên nhiều executor</w:t>
+            </w:r>
+          </w:p>
+        </w:tc>
+      </w:tr>
+      <w:tr>
+        <w:tc>
+          <w:tcPr>
+            <w:tcW w:type="dxa" w:w="3118"/>
+          </w:tcPr>
+          <w:p>
+            <w:r>
+              <w:rPr>
+                <w:sz w:val="21"/>
+              </w:rPr>
+            </w:r>
+            <w:r>
+              <w:rPr>
+                <w:sz w:val="21"/>
+              </w:rPr>
+              <w:t>Giới hạn</w:t>
+            </w:r>
+          </w:p>
+        </w:tc>
+        <w:tc>
+          <w:tcPr>
+            <w:tcW w:type="dxa" w:w="3118"/>
+          </w:tcPr>
+          <w:p>
+            <w:r>
+              <w:rPr>
+                <w:sz w:val="21"/>
+              </w:rPr>
+            </w:r>
+            <w:r>
+              <w:rPr>
+                <w:sz w:val="21"/>
+              </w:rPr>
+              <w:t>Dữ liệu phải vừa RAM</w:t>
+            </w:r>
+          </w:p>
+        </w:tc>
+        <w:tc>
+          <w:tcPr>
+            <w:tcW w:type="dxa" w:w="3118"/>
+          </w:tcPr>
+          <w:p>
+            <w:r>
+              <w:rPr>
+                <w:sz w:val="21"/>
+              </w:rPr>
+            </w:r>
+            <w:r>
+              <w:rPr>
+                <w:sz w:val="21"/>
+              </w:rPr>
+              <w:t>Chỉ giới hạn bởi dung lượng cụm</w:t>
+            </w:r>
+          </w:p>
+        </w:tc>
+      </w:tr>
+      <w:tr>
+        <w:tc>
+          <w:tcPr>
+            <w:tcW w:type="dxa" w:w="3118"/>
+          </w:tcPr>
+          <w:p>
+            <w:r>
+              <w:rPr>
+                <w:sz w:val="21"/>
+              </w:rPr>
+            </w:r>
+            <w:r>
+              <w:rPr>
+                <w:sz w:val="21"/>
+              </w:rPr>
+              <w:t>Đầu ra</w:t>
+            </w:r>
+          </w:p>
+        </w:tc>
+        <w:tc>
+          <w:tcPr>
+            <w:tcW w:type="dxa" w:w="3118"/>
+          </w:tcPr>
+          <w:p>
+            <w:r>
+              <w:rPr>
+                <w:sz w:val="21"/>
+              </w:rPr>
+            </w:r>
+            <w:r>
+              <w:rPr>
+                <w:sz w:val="21"/>
+              </w:rPr>
+              <w:t>Biểu đồ PNG cho báo cáo</w:t>
+            </w:r>
+          </w:p>
+        </w:tc>
+        <w:tc>
+          <w:tcPr>
+            <w:tcW w:type="dxa" w:w="3118"/>
+          </w:tcPr>
+          <w:p>
+            <w:r>
+              <w:rPr>
+                <w:sz w:val="21"/>
+              </w:rPr>
+            </w:r>
+            <w:r>
+              <w:rPr>
+                <w:sz w:val="21"/>
+              </w:rPr>
+              <w:t xml:space="preserve">Parquet ở lớp </w:t>
+            </w:r>
+            <w:r>
+              <w:rPr>
+                <w:rFonts w:ascii="Consolas" w:hAnsi="Consolas"/>
+                <w:color w:val="EE4D2D"/>
+                <w:sz w:val="21"/>
+              </w:rPr>
+              <w:t>curated</w:t>
+            </w:r>
+            <w:r>
+              <w:rPr>
+                <w:sz w:val="21"/>
+              </w:rPr>
+              <w:t xml:space="preserve"> + CSV</w:t>
+            </w:r>
+          </w:p>
+        </w:tc>
+      </w:tr>
+      <w:tr>
+        <w:tc>
+          <w:tcPr>
+            <w:tcW w:type="dxa" w:w="3118"/>
+          </w:tcPr>
+          <w:p>
+            <w:r>
+              <w:rPr>
+                <w:sz w:val="21"/>
+              </w:rPr>
+            </w:r>
+            <w:r>
+              <w:rPr>
+                <w:sz w:val="21"/>
+              </w:rPr>
+              <w:t>Phù hợp khi</w:t>
+            </w:r>
+          </w:p>
+        </w:tc>
+        <w:tc>
+          <w:tcPr>
+            <w:tcW w:type="dxa" w:w="3118"/>
+          </w:tcPr>
+          <w:p>
+            <w:r>
+              <w:rPr>
+                <w:sz w:val="21"/>
+              </w:rPr>
+            </w:r>
+            <w:r>
+              <w:rPr>
+                <w:sz w:val="21"/>
+              </w:rPr>
+              <w:t>Vài chục nghìn tới vài triệu dòng</w:t>
+            </w:r>
+          </w:p>
+        </w:tc>
+        <w:tc>
+          <w:tcPr>
+            <w:tcW w:type="dxa" w:w="3118"/>
+          </w:tcPr>
+          <w:p>
+            <w:r>
+              <w:rPr>
+                <w:sz w:val="21"/>
+              </w:rPr>
+            </w:r>
+            <w:r>
+              <w:rPr>
+                <w:sz w:val="21"/>
+              </w:rPr>
+              <w:t>Từ hàng chục triệu dòng trở lên</w:t>
+            </w:r>
+          </w:p>
+        </w:tc>
+      </w:tr>
+    </w:tbl>
+    <w:p/>
+    <w:p>
+      <w:pPr>
+        <w:jc w:val="both"/>
+      </w:pPr>
+      <w:r>
+        <w:t xml:space="preserve">Với quy mô dữ liệu của đồ án (khoảng 72.000 bản ghi), pandas thực tế </w:t>
+      </w:r>
+      <w:r>
+        <w:rPr>
+          <w:b/>
+        </w:rPr>
+        <w:t>nhanh hơn</w:t>
+      </w:r>
+      <w:r>
+        <w:t xml:space="preserve"> Spark, vì Spark mất vài giây khởi động JVM và lập kế hoạch thực thi. Điều này không mâu thuẫn với việc chọn Spark: giá trị của nó nằm ở chỗ khi dữ liệu tăng lên hàng trăm triệu dòng thì pandas không chạy nổi nữa, còn Spark chỉ cần thêm máy vào cụm. Đây cũng là một kết luận nghiệp vụ đáng lưu ý — </w:t>
+      </w:r>
+      <w:r>
+        <w:rPr>
+          <w:b/>
+        </w:rPr>
+        <w:t>không phải bài toán nào cũng cần Big Data</w:t>
+      </w:r>
+      <w:r>
+        <w:t>.</w:t>
+      </w:r>
+    </w:p>
+    <w:p>
+      <w:pPr>
+        <w:pStyle w:val="Heading2"/>
+      </w:pPr>
+      <w:r>
+        <w:t>4B.5. Kết quả chạy thực tế</w:t>
+      </w:r>
+    </w:p>
+    <w:p>
+      <w:pPr>
+        <w:jc w:val="both"/>
+      </w:pPr>
+      <w:r>
+        <w:t xml:space="preserve">Spark 3.5.3 đọc trực tiếp từ </w:t>
+      </w:r>
+      <w:r>
+        <w:rPr>
+          <w:rFonts w:ascii="Consolas" w:hAnsi="Consolas"/>
+          <w:color w:val="EE4D2D"/>
+          <w:sz w:val="22"/>
+        </w:rPr>
+        <w:t>hdfs://127.0.0.1:9000/ecommerce/raw</w:t>
+      </w:r>
+      <w:r>
+        <w:t>:</w:t>
+      </w:r>
+    </w:p>
+    <w:tbl>
+      <w:tblPr>
+        <w:tblStyle w:val="TableGrid"/>
+        <w:tblW w:type="auto" w:w="0"/>
+        <w:jc w:val="center"/>
+        <w:tblLook w:firstColumn="1" w:firstRow="1" w:lastColumn="0" w:lastRow="0" w:noHBand="0" w:noVBand="1" w:val="04A0"/>
+      </w:tblPr>
+      <w:tblGrid>
+        <w:gridCol w:w="3118"/>
+        <w:gridCol w:w="3118"/>
+        <w:gridCol w:w="3118"/>
+      </w:tblGrid>
+      <w:tr>
+        <w:tc>
+          <w:tcPr>
+            <w:tcW w:type="dxa" w:w="3118"/>
+            <w:shd w:val="clear" w:fill="FFE8E1"/>
+          </w:tcPr>
+          <w:p>
+            <w:r>
+              <w:rPr>
+                <w:b/>
+                <w:sz w:val="21"/>
+              </w:rPr>
+            </w:r>
+            <w:r>
+              <w:rPr>
+                <w:b/>
+                <w:sz w:val="21"/>
+              </w:rPr>
+              <w:t>Tập dữ liệu</w:t>
+            </w:r>
+          </w:p>
+        </w:tc>
+        <w:tc>
+          <w:tcPr>
+            <w:tcW w:type="dxa" w:w="3118"/>
+            <w:shd w:val="clear" w:fill="FFE8E1"/>
+          </w:tcPr>
+          <w:p>
+            <w:r>
+              <w:rPr>
+                <w:b/>
+                <w:sz w:val="21"/>
+              </w:rPr>
+            </w:r>
+            <w:r>
+              <w:rPr>
+                <w:b/>
+                <w:sz w:val="21"/>
+              </w:rPr>
+              <w:t>Số dòng</w:t>
+            </w:r>
+          </w:p>
+        </w:tc>
+        <w:tc>
+          <w:tcPr>
+            <w:tcW w:type="dxa" w:w="3118"/>
+            <w:shd w:val="clear" w:fill="FFE8E1"/>
+          </w:tcPr>
+          <w:p>
+            <w:r>
+              <w:rPr>
+                <w:b/>
+                <w:sz w:val="21"/>
+              </w:rPr>
+            </w:r>
+            <w:r>
+              <w:rPr>
+                <w:b/>
+                <w:sz w:val="21"/>
+              </w:rPr>
+              <w:t>Số phân vùng Spark</w:t>
+            </w:r>
+          </w:p>
+        </w:tc>
+      </w:tr>
+      <w:tr>
+        <w:tc>
+          <w:tcPr>
+            <w:tcW w:type="dxa" w:w="3118"/>
+          </w:tcPr>
+          <w:p>
+            <w:r>
+              <w:rPr>
+                <w:sz w:val="21"/>
+              </w:rPr>
+            </w:r>
+            <w:r>
+              <w:rPr>
+                <w:rFonts w:ascii="Consolas" w:hAnsi="Consolas"/>
+                <w:color w:val="EE4D2D"/>
+                <w:sz w:val="21"/>
+              </w:rPr>
+              <w:t>dim_product</w:t>
+            </w:r>
+          </w:p>
+        </w:tc>
+        <w:tc>
+          <w:tcPr>
+            <w:tcW w:type="dxa" w:w="3118"/>
+          </w:tcPr>
+          <w:p>
+            <w:r>
+              <w:rPr>
+                <w:sz w:val="21"/>
+              </w:rPr>
+            </w:r>
+            <w:r>
+              <w:rPr>
+                <w:sz w:val="21"/>
+              </w:rPr>
+              <w:t>300</w:t>
+            </w:r>
+          </w:p>
+        </w:tc>
+        <w:tc>
+          <w:tcPr>
+            <w:tcW w:type="dxa" w:w="3118"/>
+          </w:tcPr>
+          <w:p>
+            <w:r>
+              <w:rPr>
+                <w:sz w:val="21"/>
+              </w:rPr>
+            </w:r>
+            <w:r>
+              <w:rPr>
+                <w:sz w:val="21"/>
+              </w:rPr>
+              <w:t>1</w:t>
+            </w:r>
+          </w:p>
+        </w:tc>
+      </w:tr>
+      <w:tr>
+        <w:tc>
+          <w:tcPr>
+            <w:tcW w:type="dxa" w:w="3118"/>
+          </w:tcPr>
+          <w:p>
+            <w:r>
+              <w:rPr>
+                <w:sz w:val="21"/>
+              </w:rPr>
+            </w:r>
+            <w:r>
+              <w:rPr>
+                <w:rFonts w:ascii="Consolas" w:hAnsi="Consolas"/>
+                <w:color w:val="EE4D2D"/>
+                <w:sz w:val="21"/>
+              </w:rPr>
+              <w:t>fact_order_line</w:t>
+            </w:r>
+          </w:p>
+        </w:tc>
+        <w:tc>
+          <w:tcPr>
+            <w:tcW w:type="dxa" w:w="3118"/>
+          </w:tcPr>
+          <w:p>
+            <w:r>
+              <w:rPr>
+                <w:sz w:val="21"/>
+              </w:rPr>
+            </w:r>
+            <w:r>
+              <w:rPr>
+                <w:sz w:val="21"/>
+              </w:rPr>
+              <w:t>14.319</w:t>
+            </w:r>
+          </w:p>
+        </w:tc>
+        <w:tc>
+          <w:tcPr>
+            <w:tcW w:type="dxa" w:w="3118"/>
+          </w:tcPr>
+          <w:p>
+            <w:r>
+              <w:rPr>
+                <w:sz w:val="21"/>
+              </w:rPr>
+            </w:r>
+            <w:r>
+              <w:rPr>
+                <w:sz w:val="21"/>
+              </w:rPr>
+              <w:t>1</w:t>
+            </w:r>
+          </w:p>
+        </w:tc>
+      </w:tr>
+      <w:tr>
+        <w:tc>
+          <w:tcPr>
+            <w:tcW w:type="dxa" w:w="3118"/>
+          </w:tcPr>
+          <w:p>
+            <w:r>
+              <w:rPr>
+                <w:sz w:val="21"/>
+              </w:rPr>
+            </w:r>
+            <w:r>
+              <w:rPr>
+                <w:rFonts w:ascii="Consolas" w:hAnsi="Consolas"/>
+                <w:color w:val="EE4D2D"/>
+                <w:sz w:val="21"/>
+              </w:rPr>
+              <w:t>fact_shipment</w:t>
+            </w:r>
+          </w:p>
+        </w:tc>
+        <w:tc>
+          <w:tcPr>
+            <w:tcW w:type="dxa" w:w="3118"/>
+          </w:tcPr>
+          <w:p>
+            <w:r>
+              <w:rPr>
+                <w:sz w:val="21"/>
+              </w:rPr>
+            </w:r>
+            <w:r>
+              <w:rPr>
+                <w:sz w:val="21"/>
+              </w:rPr>
+              <w:t>3.972</w:t>
+            </w:r>
+          </w:p>
+        </w:tc>
+        <w:tc>
+          <w:tcPr>
+            <w:tcW w:type="dxa" w:w="3118"/>
+          </w:tcPr>
+          <w:p>
+            <w:r>
+              <w:rPr>
+                <w:sz w:val="21"/>
+              </w:rPr>
+            </w:r>
+            <w:r>
+              <w:rPr>
+                <w:sz w:val="21"/>
+              </w:rPr>
+              <w:t>1</w:t>
+            </w:r>
+          </w:p>
+        </w:tc>
+      </w:tr>
+      <w:tr>
+        <w:tc>
+          <w:tcPr>
+            <w:tcW w:type="dxa" w:w="3118"/>
+          </w:tcPr>
+          <w:p>
+            <w:r>
+              <w:rPr>
+                <w:sz w:val="21"/>
+              </w:rPr>
+            </w:r>
+            <w:r>
+              <w:rPr>
+                <w:rFonts w:ascii="Consolas" w:hAnsi="Consolas"/>
+                <w:color w:val="EE4D2D"/>
+                <w:sz w:val="21"/>
+              </w:rPr>
+              <w:t>clickstream_events</w:t>
+            </w:r>
+          </w:p>
+        </w:tc>
+        <w:tc>
+          <w:tcPr>
+            <w:tcW w:type="dxa" w:w="3118"/>
+          </w:tcPr>
+          <w:p>
+            <w:r>
+              <w:rPr>
+                <w:sz w:val="21"/>
+              </w:rPr>
+            </w:r>
+            <w:r>
+              <w:rPr>
+                <w:sz w:val="21"/>
+              </w:rPr>
+              <w:t>50.029</w:t>
+            </w:r>
+          </w:p>
+        </w:tc>
+        <w:tc>
+          <w:tcPr>
+            <w:tcW w:type="dxa" w:w="3118"/>
+          </w:tcPr>
+          <w:p>
+            <w:r>
+              <w:rPr>
+                <w:sz w:val="21"/>
+              </w:rPr>
+            </w:r>
+            <w:r>
+              <w:rPr>
+                <w:sz w:val="21"/>
+              </w:rPr>
+              <w:t>11</w:t>
+            </w:r>
+          </w:p>
+        </w:tc>
+      </w:tr>
+      <w:tr>
+        <w:tc>
+          <w:tcPr>
+            <w:tcW w:type="dxa" w:w="3118"/>
+          </w:tcPr>
+          <w:p>
+            <w:r>
+              <w:rPr>
+                <w:sz w:val="21"/>
+              </w:rPr>
+            </w:r>
+            <w:r>
+              <w:rPr>
+                <w:rFonts w:ascii="Consolas" w:hAnsi="Consolas"/>
+                <w:color w:val="EE4D2D"/>
+                <w:sz w:val="21"/>
+              </w:rPr>
+              <w:t>shipment_scans</w:t>
+            </w:r>
+          </w:p>
+        </w:tc>
+        <w:tc>
+          <w:tcPr>
+            <w:tcW w:type="dxa" w:w="3118"/>
+          </w:tcPr>
+          <w:p>
+            <w:r>
+              <w:rPr>
+                <w:sz w:val="21"/>
+              </w:rPr>
+            </w:r>
+            <w:r>
+              <w:rPr>
+                <w:sz w:val="21"/>
+              </w:rPr>
+              <w:t>22.195</w:t>
+            </w:r>
+          </w:p>
+        </w:tc>
+        <w:tc>
+          <w:tcPr>
+            <w:tcW w:type="dxa" w:w="3118"/>
+          </w:tcPr>
+          <w:p>
+            <w:r>
+              <w:rPr>
+                <w:sz w:val="21"/>
+              </w:rPr>
+            </w:r>
+            <w:r>
+              <w:rPr>
+                <w:sz w:val="21"/>
+              </w:rPr>
+              <w:t>1</w:t>
+            </w:r>
+          </w:p>
+        </w:tc>
+      </w:tr>
+    </w:tbl>
+    <w:p/>
+    <w:p>
+      <w:pPr>
+        <w:pStyle w:val="Heading3"/>
+      </w:pPr>
+      <w:r>
+        <w:t>Phễu chuyển đổi (tính bằng Spark)</w:t>
+      </w:r>
+    </w:p>
+    <w:tbl>
+      <w:tblPr>
+        <w:tblStyle w:val="TableGrid"/>
+        <w:tblW w:type="auto" w:w="0"/>
+        <w:jc w:val="center"/>
+        <w:tblLook w:firstColumn="1" w:firstRow="1" w:lastColumn="0" w:lastRow="0" w:noHBand="0" w:noVBand="1" w:val="04A0"/>
+      </w:tblPr>
+      <w:tblGrid>
+        <w:gridCol w:w="2339"/>
+        <w:gridCol w:w="2339"/>
+        <w:gridCol w:w="2339"/>
+        <w:gridCol w:w="2339"/>
+      </w:tblGrid>
+      <w:tr>
+        <w:tc>
+          <w:tcPr>
+            <w:tcW w:type="dxa" w:w="2339"/>
+            <w:shd w:val="clear" w:fill="FFE8E1"/>
+          </w:tcPr>
+          <w:p>
+            <w:r>
+              <w:rPr>
+                <w:b/>
+                <w:sz w:val="21"/>
+              </w:rPr>
+            </w:r>
+            <w:r>
+              <w:rPr>
+                <w:b/>
+                <w:sz w:val="21"/>
+              </w:rPr>
+              <w:t>Bước</w:t>
+            </w:r>
+          </w:p>
+        </w:tc>
+        <w:tc>
+          <w:tcPr>
+            <w:tcW w:type="dxa" w:w="2339"/>
+            <w:shd w:val="clear" w:fill="FFE8E1"/>
+          </w:tcPr>
+          <w:p>
+            <w:r>
+              <w:rPr>
+                <w:b/>
+                <w:sz w:val="21"/>
+              </w:rPr>
+            </w:r>
+            <w:r>
+              <w:rPr>
+                <w:b/>
+                <w:sz w:val="21"/>
+              </w:rPr>
+              <w:t>Số phiên</w:t>
+            </w:r>
+          </w:p>
+        </w:tc>
+        <w:tc>
+          <w:tcPr>
+            <w:tcW w:type="dxa" w:w="2339"/>
+            <w:shd w:val="clear" w:fill="FFE8E1"/>
+          </w:tcPr>
+          <w:p>
+            <w:r>
+              <w:rPr>
+                <w:b/>
+                <w:sz w:val="21"/>
+              </w:rPr>
+            </w:r>
+            <w:r>
+              <w:rPr>
+                <w:b/>
+                <w:sz w:val="21"/>
+              </w:rPr>
+              <w:t>Số sự kiện</w:t>
+            </w:r>
+          </w:p>
+        </w:tc>
+        <w:tc>
+          <w:tcPr>
+            <w:tcW w:type="dxa" w:w="2339"/>
+            <w:shd w:val="clear" w:fill="FFE8E1"/>
+          </w:tcPr>
+          <w:p>
+            <w:r>
+              <w:rPr>
+                <w:b/>
+                <w:sz w:val="21"/>
+              </w:rPr>
+            </w:r>
+            <w:r>
+              <w:rPr>
+                <w:b/>
+                <w:sz w:val="21"/>
+              </w:rPr>
+              <w:t>Tỷ lệ còn lại</w:t>
+            </w:r>
+          </w:p>
+        </w:tc>
+      </w:tr>
+      <w:tr>
+        <w:tc>
+          <w:tcPr>
+            <w:tcW w:type="dxa" w:w="2339"/>
+          </w:tcPr>
+          <w:p>
+            <w:r>
+              <w:rPr>
+                <w:sz w:val="21"/>
+              </w:rPr>
+            </w:r>
+            <w:r>
+              <w:rPr>
+                <w:sz w:val="21"/>
+              </w:rPr>
+              <w:t>Xem sản phẩm</w:t>
+            </w:r>
+          </w:p>
+        </w:tc>
+        <w:tc>
+          <w:tcPr>
+            <w:tcW w:type="dxa" w:w="2339"/>
+          </w:tcPr>
+          <w:p>
+            <w:r>
+              <w:rPr>
+                <w:sz w:val="21"/>
+              </w:rPr>
+            </w:r>
+            <w:r>
+              <w:rPr>
+                <w:sz w:val="21"/>
+              </w:rPr>
+              <w:t>6.043</w:t>
+            </w:r>
+          </w:p>
+        </w:tc>
+        <w:tc>
+          <w:tcPr>
+            <w:tcW w:type="dxa" w:w="2339"/>
+          </w:tcPr>
+          <w:p>
+            <w:r>
+              <w:rPr>
+                <w:sz w:val="21"/>
+              </w:rPr>
+            </w:r>
+            <w:r>
+              <w:rPr>
+                <w:sz w:val="21"/>
+              </w:rPr>
+              <w:t>14.019</w:t>
+            </w:r>
+          </w:p>
+        </w:tc>
+        <w:tc>
+          <w:tcPr>
+            <w:tcW w:type="dxa" w:w="2339"/>
+          </w:tcPr>
+          <w:p>
+            <w:r>
+              <w:rPr>
+                <w:sz w:val="21"/>
+              </w:rPr>
+            </w:r>
+            <w:r>
+              <w:rPr>
+                <w:sz w:val="21"/>
+              </w:rPr>
+              <w:t>100,00%</w:t>
+            </w:r>
+          </w:p>
+        </w:tc>
+      </w:tr>
+      <w:tr>
+        <w:tc>
+          <w:tcPr>
+            <w:tcW w:type="dxa" w:w="2339"/>
+          </w:tcPr>
+          <w:p>
+            <w:r>
+              <w:rPr>
+                <w:sz w:val="21"/>
+              </w:rPr>
+            </w:r>
+            <w:r>
+              <w:rPr>
+                <w:sz w:val="21"/>
+              </w:rPr>
+              <w:t>Thêm vào giỏ</w:t>
+            </w:r>
+          </w:p>
+        </w:tc>
+        <w:tc>
+          <w:tcPr>
+            <w:tcW w:type="dxa" w:w="2339"/>
+          </w:tcPr>
+          <w:p>
+            <w:r>
+              <w:rPr>
+                <w:sz w:val="21"/>
+              </w:rPr>
+            </w:r>
+            <w:r>
+              <w:rPr>
+                <w:sz w:val="21"/>
+              </w:rPr>
+              <w:t>4.182</w:t>
+            </w:r>
+          </w:p>
+        </w:tc>
+        <w:tc>
+          <w:tcPr>
+            <w:tcW w:type="dxa" w:w="2339"/>
+          </w:tcPr>
+          <w:p>
+            <w:r>
+              <w:rPr>
+                <w:sz w:val="21"/>
+              </w:rPr>
+            </w:r>
+            <w:r>
+              <w:rPr>
+                <w:sz w:val="21"/>
+              </w:rPr>
+              <w:t>6.468</w:t>
+            </w:r>
+          </w:p>
+        </w:tc>
+        <w:tc>
+          <w:tcPr>
+            <w:tcW w:type="dxa" w:w="2339"/>
+          </w:tcPr>
+          <w:p>
+            <w:r>
+              <w:rPr>
+                <w:sz w:val="21"/>
+              </w:rPr>
+            </w:r>
+            <w:r>
+              <w:rPr>
+                <w:sz w:val="21"/>
+              </w:rPr>
+              <w:t>69,20%</w:t>
+            </w:r>
+          </w:p>
+        </w:tc>
+      </w:tr>
+      <w:tr>
+        <w:tc>
+          <w:tcPr>
+            <w:tcW w:type="dxa" w:w="2339"/>
+          </w:tcPr>
+          <w:p>
+            <w:r>
+              <w:rPr>
+                <w:sz w:val="21"/>
+              </w:rPr>
+            </w:r>
+            <w:r>
+              <w:rPr>
+                <w:sz w:val="21"/>
+              </w:rPr>
+              <w:t>Bắt đầu thanh toán</w:t>
+            </w:r>
+          </w:p>
+        </w:tc>
+        <w:tc>
+          <w:tcPr>
+            <w:tcW w:type="dxa" w:w="2339"/>
+          </w:tcPr>
+          <w:p>
+            <w:r>
+              <w:rPr>
+                <w:sz w:val="21"/>
+              </w:rPr>
+            </w:r>
+            <w:r>
+              <w:rPr>
+                <w:sz w:val="21"/>
+              </w:rPr>
+              <w:t>2.394</w:t>
+            </w:r>
+          </w:p>
+        </w:tc>
+        <w:tc>
+          <w:tcPr>
+            <w:tcW w:type="dxa" w:w="2339"/>
+          </w:tcPr>
+          <w:p>
+            <w:r>
+              <w:rPr>
+                <w:sz w:val="21"/>
+              </w:rPr>
+            </w:r>
+            <w:r>
+              <w:rPr>
+                <w:sz w:val="21"/>
+              </w:rPr>
+              <w:t>2.961</w:t>
+            </w:r>
+          </w:p>
+        </w:tc>
+        <w:tc>
+          <w:tcPr>
+            <w:tcW w:type="dxa" w:w="2339"/>
+          </w:tcPr>
+          <w:p>
+            <w:r>
+              <w:rPr>
+                <w:sz w:val="21"/>
+              </w:rPr>
+            </w:r>
+            <w:r>
+              <w:rPr>
+                <w:sz w:val="21"/>
+              </w:rPr>
+              <w:t>39,62%</w:t>
+            </w:r>
+          </w:p>
+        </w:tc>
+      </w:tr>
+      <w:tr>
+        <w:tc>
+          <w:tcPr>
+            <w:tcW w:type="dxa" w:w="2339"/>
+          </w:tcPr>
+          <w:p>
+            <w:r>
+              <w:rPr>
+                <w:sz w:val="21"/>
+              </w:rPr>
+            </w:r>
+            <w:r>
+              <w:rPr>
+                <w:sz w:val="21"/>
+              </w:rPr>
+              <w:t>Mua hàng</w:t>
+            </w:r>
+          </w:p>
+        </w:tc>
+        <w:tc>
+          <w:tcPr>
+            <w:tcW w:type="dxa" w:w="2339"/>
+          </w:tcPr>
+          <w:p>
+            <w:r>
+              <w:rPr>
+                <w:sz w:val="21"/>
+              </w:rPr>
+            </w:r>
+            <w:r>
+              <w:rPr>
+                <w:sz w:val="21"/>
+              </w:rPr>
+              <w:t>1.350</w:t>
+            </w:r>
+          </w:p>
+        </w:tc>
+        <w:tc>
+          <w:tcPr>
+            <w:tcW w:type="dxa" w:w="2339"/>
+          </w:tcPr>
+          <w:p>
+            <w:r>
+              <w:rPr>
+                <w:sz w:val="21"/>
+              </w:rPr>
+            </w:r>
+            <w:r>
+              <w:rPr>
+                <w:sz w:val="21"/>
+              </w:rPr>
+              <w:t>1.520</w:t>
+            </w:r>
+          </w:p>
+        </w:tc>
+        <w:tc>
+          <w:tcPr>
+            <w:tcW w:type="dxa" w:w="2339"/>
+          </w:tcPr>
+          <w:p>
+            <w:r>
+              <w:rPr>
+                <w:sz w:val="21"/>
+              </w:rPr>
+            </w:r>
+            <w:r>
+              <w:rPr>
+                <w:sz w:val="21"/>
+              </w:rPr>
+              <w:t>22,34%</w:t>
+            </w:r>
+          </w:p>
+        </w:tc>
+      </w:tr>
+    </w:tbl>
+    <w:p/>
+    <w:p>
+      <w:pPr>
+        <w:pStyle w:val="Heading3"/>
+      </w:pPr>
+      <w:r>
+        <w:t>Hiệu suất vận chuyển — kết quả của phép gộp hai nguồn</w:t>
+      </w:r>
+    </w:p>
+    <w:p>
+      <w:pPr>
+        <w:jc w:val="both"/>
+      </w:pPr>
+      <w:r>
+        <w:t xml:space="preserve">Bảng dưới đây là </w:t>
+      </w:r>
+      <w:r>
+        <w:rPr>
+          <w:b/>
+        </w:rPr>
+        <w:t>minh chứng rõ nhất cho giá trị của kiến trúc kép</w:t>
+      </w:r>
+      <w:r>
+        <w:t xml:space="preserve">: ba cột đầu đến từ CSDL quan hệ, hai cột cuối đến từ log quét mã vạch trong MongoDB, gộp trên khóa </w:t>
+      </w:r>
+      <w:r>
+        <w:rPr>
+          <w:rFonts w:ascii="Consolas" w:hAnsi="Consolas"/>
+          <w:color w:val="EE4D2D"/>
+          <w:sz w:val="22"/>
+        </w:rPr>
+        <w:t>tracking_no</w:t>
+      </w:r>
+      <w:r>
+        <w:t>.</w:t>
+      </w:r>
+    </w:p>
+    <w:tbl>
+      <w:tblPr>
+        <w:tblStyle w:val="TableGrid"/>
+        <w:tblW w:type="auto" w:w="0"/>
+        <w:jc w:val="center"/>
+        <w:tblLook w:firstColumn="1" w:firstRow="1" w:lastColumn="0" w:lastRow="0" w:noHBand="0" w:noVBand="1" w:val="04A0"/>
+      </w:tblPr>
+      <w:tblGrid>
+        <w:gridCol w:w="1559"/>
+        <w:gridCol w:w="1559"/>
+        <w:gridCol w:w="1559"/>
+        <w:gridCol w:w="1559"/>
+        <w:gridCol w:w="1559"/>
+        <w:gridCol w:w="1559"/>
+      </w:tblGrid>
+      <w:tr>
+        <w:tc>
+          <w:tcPr>
+            <w:tcW w:type="dxa" w:w="1559"/>
+            <w:shd w:val="clear" w:fill="FFE8E1"/>
+          </w:tcPr>
+          <w:p>
+            <w:r>
+              <w:rPr>
+                <w:b/>
+                <w:sz w:val="21"/>
+              </w:rPr>
+            </w:r>
+            <w:r>
+              <w:rPr>
+                <w:b/>
+                <w:sz w:val="21"/>
+              </w:rPr>
+              <w:t>Đơn vị vận chuyển</w:t>
+            </w:r>
+          </w:p>
+        </w:tc>
+        <w:tc>
+          <w:tcPr>
+            <w:tcW w:type="dxa" w:w="1559"/>
+            <w:shd w:val="clear" w:fill="FFE8E1"/>
+          </w:tcPr>
+          <w:p>
+            <w:r>
+              <w:rPr>
+                <w:b/>
+                <w:sz w:val="21"/>
+              </w:rPr>
+            </w:r>
+            <w:r>
+              <w:rPr>
+                <w:b/>
+                <w:sz w:val="21"/>
+              </w:rPr>
+              <w:t>Số lô</w:t>
+            </w:r>
+          </w:p>
+        </w:tc>
+        <w:tc>
+          <w:tcPr>
+            <w:tcW w:type="dxa" w:w="1559"/>
+            <w:shd w:val="clear" w:fill="FFE8E1"/>
+          </w:tcPr>
+          <w:p>
+            <w:r>
+              <w:rPr>
+                <w:b/>
+                <w:sz w:val="21"/>
+              </w:rPr>
+            </w:r>
+            <w:r>
+              <w:rPr>
+                <w:b/>
+                <w:sz w:val="21"/>
+              </w:rPr>
+              <w:t>Số ngày giao TB</w:t>
+            </w:r>
+          </w:p>
+        </w:tc>
+        <w:tc>
+          <w:tcPr>
+            <w:tcW w:type="dxa" w:w="1559"/>
+            <w:shd w:val="clear" w:fill="FFE8E1"/>
+          </w:tcPr>
+          <w:p>
+            <w:r>
+              <w:rPr>
+                <w:b/>
+                <w:sz w:val="21"/>
+              </w:rPr>
+            </w:r>
+            <w:r>
+              <w:rPr>
+                <w:b/>
+                <w:sz w:val="21"/>
+              </w:rPr>
+              <w:t>P95 (ngày)</w:t>
+            </w:r>
+          </w:p>
+        </w:tc>
+        <w:tc>
+          <w:tcPr>
+            <w:tcW w:type="dxa" w:w="1559"/>
+            <w:shd w:val="clear" w:fill="FFE8E1"/>
+          </w:tcPr>
+          <w:p>
+            <w:r>
+              <w:rPr>
+                <w:b/>
+                <w:sz w:val="21"/>
+              </w:rPr>
+            </w:r>
+            <w:r>
+              <w:rPr>
+                <w:b/>
+                <w:sz w:val="21"/>
+              </w:rPr>
+              <w:t>Số lần quét TB</w:t>
+            </w:r>
+          </w:p>
+        </w:tc>
+        <w:tc>
+          <w:tcPr>
+            <w:tcW w:type="dxa" w:w="1559"/>
+            <w:shd w:val="clear" w:fill="FFE8E1"/>
+          </w:tcPr>
+          <w:p>
+            <w:r>
+              <w:rPr>
+                <w:b/>
+                <w:sz w:val="21"/>
+              </w:rPr>
+            </w:r>
+            <w:r>
+              <w:rPr>
+                <w:b/>
+                <w:sz w:val="21"/>
+              </w:rPr>
+              <w:t>Số trạm TB</w:t>
+            </w:r>
+          </w:p>
+        </w:tc>
+      </w:tr>
+      <w:tr>
+        <w:tc>
+          <w:tcPr>
+            <w:tcW w:type="dxa" w:w="1559"/>
+          </w:tcPr>
+          <w:p>
+            <w:r>
+              <w:rPr>
+                <w:sz w:val="21"/>
+              </w:rPr>
+            </w:r>
+            <w:r>
+              <w:rPr>
+                <w:sz w:val="21"/>
+              </w:rPr>
+              <w:t>GHN</w:t>
+            </w:r>
+          </w:p>
+        </w:tc>
+        <w:tc>
+          <w:tcPr>
+            <w:tcW w:type="dxa" w:w="1559"/>
+          </w:tcPr>
+          <w:p>
+            <w:r>
+              <w:rPr>
+                <w:sz w:val="21"/>
+              </w:rPr>
+            </w:r>
+            <w:r>
+              <w:rPr>
+                <w:sz w:val="21"/>
+              </w:rPr>
+              <w:t>719</w:t>
+            </w:r>
+          </w:p>
+        </w:tc>
+        <w:tc>
+          <w:tcPr>
+            <w:tcW w:type="dxa" w:w="1559"/>
+          </w:tcPr>
+          <w:p>
+            <w:r>
+              <w:rPr>
+                <w:sz w:val="21"/>
+              </w:rPr>
+            </w:r>
+            <w:r>
+              <w:rPr>
+                <w:sz w:val="21"/>
+              </w:rPr>
+              <w:t>2,18</w:t>
+            </w:r>
+          </w:p>
+        </w:tc>
+        <w:tc>
+          <w:tcPr>
+            <w:tcW w:type="dxa" w:w="1559"/>
+          </w:tcPr>
+          <w:p>
+            <w:r>
+              <w:rPr>
+                <w:sz w:val="21"/>
+              </w:rPr>
+            </w:r>
+            <w:r>
+              <w:rPr>
+                <w:sz w:val="21"/>
+              </w:rPr>
+              <w:t>3,58</w:t>
+            </w:r>
+          </w:p>
+        </w:tc>
+        <w:tc>
+          <w:tcPr>
+            <w:tcW w:type="dxa" w:w="1559"/>
+          </w:tcPr>
+          <w:p>
+            <w:r>
+              <w:rPr>
+                <w:sz w:val="21"/>
+              </w:rPr>
+            </w:r>
+            <w:r>
+              <w:rPr>
+                <w:sz w:val="21"/>
+              </w:rPr>
+              <w:t>3,9</w:t>
+            </w:r>
+          </w:p>
+        </w:tc>
+        <w:tc>
+          <w:tcPr>
+            <w:tcW w:type="dxa" w:w="1559"/>
+          </w:tcPr>
+          <w:p>
+            <w:r>
+              <w:rPr>
+                <w:sz w:val="21"/>
+              </w:rPr>
+            </w:r>
+            <w:r>
+              <w:rPr>
+                <w:sz w:val="21"/>
+              </w:rPr>
+              <w:t>3,1</w:t>
+            </w:r>
+          </w:p>
+        </w:tc>
+      </w:tr>
+      <w:tr>
+        <w:tc>
+          <w:tcPr>
+            <w:tcW w:type="dxa" w:w="1559"/>
+          </w:tcPr>
+          <w:p>
+            <w:r>
+              <w:rPr>
+                <w:sz w:val="21"/>
+              </w:rPr>
+            </w:r>
+            <w:r>
+              <w:rPr>
+                <w:sz w:val="21"/>
+              </w:rPr>
+              <w:t>GHTK</w:t>
+            </w:r>
+          </w:p>
+        </w:tc>
+        <w:tc>
+          <w:tcPr>
+            <w:tcW w:type="dxa" w:w="1559"/>
+          </w:tcPr>
+          <w:p>
+            <w:r>
+              <w:rPr>
+                <w:sz w:val="21"/>
+              </w:rPr>
+            </w:r>
+            <w:r>
+              <w:rPr>
+                <w:sz w:val="21"/>
+              </w:rPr>
+              <w:t>733</w:t>
+            </w:r>
+          </w:p>
+        </w:tc>
+        <w:tc>
+          <w:tcPr>
+            <w:tcW w:type="dxa" w:w="1559"/>
+          </w:tcPr>
+          <w:p>
+            <w:r>
+              <w:rPr>
+                <w:sz w:val="21"/>
+              </w:rPr>
+            </w:r>
+            <w:r>
+              <w:rPr>
+                <w:sz w:val="21"/>
+              </w:rPr>
+              <w:t>2,64</w:t>
+            </w:r>
+          </w:p>
+        </w:tc>
+        <w:tc>
+          <w:tcPr>
+            <w:tcW w:type="dxa" w:w="1559"/>
+          </w:tcPr>
+          <w:p>
+            <w:r>
+              <w:rPr>
+                <w:sz w:val="21"/>
+              </w:rPr>
+            </w:r>
+            <w:r>
+              <w:rPr>
+                <w:sz w:val="21"/>
+              </w:rPr>
+              <w:t>4,13</w:t>
+            </w:r>
+          </w:p>
+        </w:tc>
+        <w:tc>
+          <w:tcPr>
+            <w:tcW w:type="dxa" w:w="1559"/>
+          </w:tcPr>
+          <w:p>
+            <w:r>
+              <w:rPr>
+                <w:sz w:val="21"/>
+              </w:rPr>
+            </w:r>
+            <w:r>
+              <w:rPr>
+                <w:sz w:val="21"/>
+              </w:rPr>
+              <w:t>4,6</w:t>
+            </w:r>
+          </w:p>
+        </w:tc>
+        <w:tc>
+          <w:tcPr>
+            <w:tcW w:type="dxa" w:w="1559"/>
+          </w:tcPr>
+          <w:p>
+            <w:r>
+              <w:rPr>
+                <w:sz w:val="21"/>
+              </w:rPr>
+            </w:r>
+            <w:r>
+              <w:rPr>
+                <w:sz w:val="21"/>
+              </w:rPr>
+              <w:t>3,5</w:t>
+            </w:r>
+          </w:p>
+        </w:tc>
+      </w:tr>
+      <w:tr>
+        <w:tc>
+          <w:tcPr>
+            <w:tcW w:type="dxa" w:w="1559"/>
+          </w:tcPr>
+          <w:p>
+            <w:r>
+              <w:rPr>
+                <w:sz w:val="21"/>
+              </w:rPr>
+            </w:r>
+            <w:r>
+              <w:rPr>
+                <w:sz w:val="21"/>
+              </w:rPr>
+              <w:t>J&amp;T Express</w:t>
+            </w:r>
+          </w:p>
+        </w:tc>
+        <w:tc>
+          <w:tcPr>
+            <w:tcW w:type="dxa" w:w="1559"/>
+          </w:tcPr>
+          <w:p>
+            <w:r>
+              <w:rPr>
+                <w:sz w:val="21"/>
+              </w:rPr>
+            </w:r>
+            <w:r>
+              <w:rPr>
+                <w:sz w:val="21"/>
+              </w:rPr>
+              <w:t>670</w:t>
+            </w:r>
+          </w:p>
+        </w:tc>
+        <w:tc>
+          <w:tcPr>
+            <w:tcW w:type="dxa" w:w="1559"/>
+          </w:tcPr>
+          <w:p>
+            <w:r>
+              <w:rPr>
+                <w:sz w:val="21"/>
+              </w:rPr>
+            </w:r>
+            <w:r>
+              <w:rPr>
+                <w:sz w:val="21"/>
+              </w:rPr>
+              <w:t>3,08</w:t>
+            </w:r>
+          </w:p>
+        </w:tc>
+        <w:tc>
+          <w:tcPr>
+            <w:tcW w:type="dxa" w:w="1559"/>
+          </w:tcPr>
+          <w:p>
+            <w:r>
+              <w:rPr>
+                <w:sz w:val="21"/>
+              </w:rPr>
+            </w:r>
+            <w:r>
+              <w:rPr>
+                <w:sz w:val="21"/>
+              </w:rPr>
+              <w:t>4,62</w:t>
+            </w:r>
+          </w:p>
+        </w:tc>
+        <w:tc>
+          <w:tcPr>
+            <w:tcW w:type="dxa" w:w="1559"/>
+          </w:tcPr>
+          <w:p>
+            <w:r>
+              <w:rPr>
+                <w:sz w:val="21"/>
+              </w:rPr>
+            </w:r>
+            <w:r>
+              <w:rPr>
+                <w:sz w:val="21"/>
+              </w:rPr>
+              <w:t>5,4</w:t>
+            </w:r>
+          </w:p>
+        </w:tc>
+        <w:tc>
+          <w:tcPr>
+            <w:tcW w:type="dxa" w:w="1559"/>
+          </w:tcPr>
+          <w:p>
+            <w:r>
+              <w:rPr>
+                <w:sz w:val="21"/>
+              </w:rPr>
+            </w:r>
+            <w:r>
+              <w:rPr>
+                <w:sz w:val="21"/>
+              </w:rPr>
+              <w:t>3,9</w:t>
+            </w:r>
+          </w:p>
+        </w:tc>
+      </w:tr>
+      <w:tr>
+        <w:tc>
+          <w:tcPr>
+            <w:tcW w:type="dxa" w:w="1559"/>
+          </w:tcPr>
+          <w:p>
+            <w:r>
+              <w:rPr>
+                <w:sz w:val="21"/>
+              </w:rPr>
+            </w:r>
+            <w:r>
+              <w:rPr>
+                <w:sz w:val="21"/>
+              </w:rPr>
+              <w:t>Viettel Post</w:t>
+            </w:r>
+          </w:p>
+        </w:tc>
+        <w:tc>
+          <w:tcPr>
+            <w:tcW w:type="dxa" w:w="1559"/>
+          </w:tcPr>
+          <w:p>
+            <w:r>
+              <w:rPr>
+                <w:sz w:val="21"/>
+              </w:rPr>
+            </w:r>
+            <w:r>
+              <w:rPr>
+                <w:sz w:val="21"/>
+              </w:rPr>
+              <w:t>712</w:t>
+            </w:r>
+          </w:p>
+        </w:tc>
+        <w:tc>
+          <w:tcPr>
+            <w:tcW w:type="dxa" w:w="1559"/>
+          </w:tcPr>
+          <w:p>
+            <w:r>
+              <w:rPr>
+                <w:sz w:val="21"/>
+              </w:rPr>
+            </w:r>
+            <w:r>
+              <w:rPr>
+                <w:sz w:val="21"/>
+              </w:rPr>
+              <w:t>3,39</w:t>
+            </w:r>
+          </w:p>
+        </w:tc>
+        <w:tc>
+          <w:tcPr>
+            <w:tcW w:type="dxa" w:w="1559"/>
+          </w:tcPr>
+          <w:p>
+            <w:r>
+              <w:rPr>
+                <w:sz w:val="21"/>
+              </w:rPr>
+            </w:r>
+            <w:r>
+              <w:rPr>
+                <w:sz w:val="21"/>
+              </w:rPr>
+              <w:t>4,72</w:t>
+            </w:r>
+          </w:p>
+        </w:tc>
+        <w:tc>
+          <w:tcPr>
+            <w:tcW w:type="dxa" w:w="1559"/>
+          </w:tcPr>
+          <w:p>
+            <w:r>
+              <w:rPr>
+                <w:sz w:val="21"/>
+              </w:rPr>
+            </w:r>
+            <w:r>
+              <w:rPr>
+                <w:sz w:val="21"/>
+              </w:rPr>
+              <w:t>6,5</w:t>
+            </w:r>
+          </w:p>
+        </w:tc>
+        <w:tc>
+          <w:tcPr>
+            <w:tcW w:type="dxa" w:w="1559"/>
+          </w:tcPr>
+          <w:p>
+            <w:r>
+              <w:rPr>
+                <w:sz w:val="21"/>
+              </w:rPr>
+            </w:r>
+            <w:r>
+              <w:rPr>
+                <w:sz w:val="21"/>
+              </w:rPr>
+              <w:t>4,4</w:t>
+            </w:r>
+          </w:p>
+        </w:tc>
+      </w:tr>
+      <w:tr>
+        <w:tc>
+          <w:tcPr>
+            <w:tcW w:type="dxa" w:w="1559"/>
+          </w:tcPr>
+          <w:p>
+            <w:r>
+              <w:rPr>
+                <w:sz w:val="21"/>
+              </w:rPr>
+            </w:r>
+            <w:r>
+              <w:rPr>
+                <w:sz w:val="21"/>
+              </w:rPr>
+              <w:t>Ninja Van</w:t>
+            </w:r>
+          </w:p>
+        </w:tc>
+        <w:tc>
+          <w:tcPr>
+            <w:tcW w:type="dxa" w:w="1559"/>
+          </w:tcPr>
+          <w:p>
+            <w:r>
+              <w:rPr>
+                <w:sz w:val="21"/>
+              </w:rPr>
+            </w:r>
+            <w:r>
+              <w:rPr>
+                <w:sz w:val="21"/>
+              </w:rPr>
+              <w:t>676</w:t>
+            </w:r>
+          </w:p>
+        </w:tc>
+        <w:tc>
+          <w:tcPr>
+            <w:tcW w:type="dxa" w:w="1559"/>
+          </w:tcPr>
+          <w:p>
+            <w:r>
+              <w:rPr>
+                <w:sz w:val="21"/>
+              </w:rPr>
+            </w:r>
+            <w:r>
+              <w:rPr>
+                <w:sz w:val="21"/>
+              </w:rPr>
+              <w:t>3,85</w:t>
+            </w:r>
+          </w:p>
+        </w:tc>
+        <w:tc>
+          <w:tcPr>
+            <w:tcW w:type="dxa" w:w="1559"/>
+          </w:tcPr>
+          <w:p>
+            <w:r>
+              <w:rPr>
+                <w:sz w:val="21"/>
+              </w:rPr>
+            </w:r>
+            <w:r>
+              <w:rPr>
+                <w:sz w:val="21"/>
+              </w:rPr>
+              <w:t>5,29</w:t>
+            </w:r>
+          </w:p>
+        </w:tc>
+        <w:tc>
+          <w:tcPr>
+            <w:tcW w:type="dxa" w:w="1559"/>
+          </w:tcPr>
+          <w:p>
+            <w:r>
+              <w:rPr>
+                <w:sz w:val="21"/>
+              </w:rPr>
+            </w:r>
+            <w:r>
+              <w:rPr>
+                <w:sz w:val="21"/>
+              </w:rPr>
+              <w:t>7,5</w:t>
+            </w:r>
+          </w:p>
+        </w:tc>
+        <w:tc>
+          <w:tcPr>
+            <w:tcW w:type="dxa" w:w="1559"/>
+          </w:tcPr>
+          <w:p>
+            <w:r>
+              <w:rPr>
+                <w:sz w:val="21"/>
+              </w:rPr>
+            </w:r>
+            <w:r>
+              <w:rPr>
+                <w:sz w:val="21"/>
+              </w:rPr>
+              <w:t>4,7</w:t>
+            </w:r>
+          </w:p>
+        </w:tc>
+      </w:tr>
+    </w:tbl>
+    <w:p/>
+    <w:p>
+      <w:pPr>
+        <w:jc w:val="both"/>
+      </w:pPr>
+      <w:r>
+        <w:rPr>
+          <w:b/>
+        </w:rPr>
+        <w:t>Ý nghĩa nghiệp vụ.</w:t>
+      </w:r>
+      <w:r>
+        <w:t xml:space="preserve"> Hai cột cuối tăng đều cùng chiều với số ngày giao: GHN đi qua 3,1 trạm và giao trong 2,18 ngày, trong khi Ninja Van đi qua 4,7 trạm và mất 3,85 ngày. Mỗi trạm trung chuyển cộng thêm khoảng nửa ngày. Kết luận cho vận hành: với đơn nội thành cần gấp nên ưu tiên hãng có mạng lưới tuyến thẳng; còn muốn cải thiện hãng đang chậm thì phải giảm số chặng chứ không phải giục tài xế.</w:t>
+      </w:r>
+    </w:p>
+    <w:p>
+      <w:pPr>
+        <w:jc w:val="both"/>
+      </w:pPr>
+      <w:r>
+        <w:t>Không nguồn dữ liệu nào một mình cho ra kết luận này — CSDL quan hệ biết đơn giao mất bao lâu nhưng không biết vì sao, còn log quét mã vạch biết đường đi nhưng không biết kết quả kinh doanh.</w:t>
+      </w:r>
+    </w:p>
+    <w:p>
+      <w:r>
+        <w:br w:type="page"/>
       </w:r>
     </w:p>
     <w:p>

</xml_diff>

<commit_message>
feat: tab Big Data tren dashboard - trang thai cum HDFS, duyet cay thu muc, ket qua Spark
- API doc JMX cua NameNode va WebHDFS de lay trang thai cum va cay thu muc
- Giao dien duyet HDFS co breadcrumb, hien phan vung event_month va he so nhan ban
- Sau bang ket qua Spark kem bieu do rieng cho tung loai
- Bieu do hieu suat van chuyen dat canh nhau so lieu tu PostgreSQL va MongoDB
</commit_message>
<xml_diff>
--- a/BaoCao_ECommerce_BigData.docx
+++ b/BaoCao_ECommerce_BigData.docx
@@ -10427,6 +10427,362 @@
       </w:pPr>
       <w:r>
         <w:t>Không nguồn dữ liệu nào một mình cho ra kết luận này — CSDL quan hệ biết đơn giao mất bao lâu nhưng không biết vì sao, còn log quét mã vạch biết đường đi nhưng không biết kết quả kinh doanh.</w:t>
+      </w:r>
+    </w:p>
+    <w:p>
+      <w:pPr>
+        <w:pStyle w:val="Heading2"/>
+      </w:pPr>
+      <w:r>
+        <w:t>4B.6. Demo trên giao diện web</w:t>
+      </w:r>
+    </w:p>
+    <w:p>
+      <w:pPr>
+        <w:jc w:val="both"/>
+      </w:pPr>
+      <w:r>
+        <w:t xml:space="preserve">Trang </w:t>
+      </w:r>
+      <w:r>
+        <w:rPr>
+          <w:rFonts w:ascii="Consolas" w:hAnsi="Consolas"/>
+          <w:color w:val="EE4D2D"/>
+          <w:sz w:val="22"/>
+        </w:rPr>
+        <w:t>/bigdata</w:t>
+      </w:r>
+      <w:r>
+        <w:t xml:space="preserve"> của ứng dụng demo trình bày toàn bộ tầng Big Data, phục vụ đúng yêu cầu </w:t>
+      </w:r>
+      <w:r>
+        <w:rPr>
+          <w:i/>
+        </w:rPr>
+        <w:t>"demo luồng dữ liệu lưu trữ trên NoSQL/Hadoop và một dashboard trực quan hóa"</w:t>
+      </w:r>
+      <w:r>
+        <w:t>:</w:t>
+      </w:r>
+    </w:p>
+    <w:tbl>
+      <w:tblPr>
+        <w:tblStyle w:val="TableGrid"/>
+        <w:tblW w:type="auto" w:w="0"/>
+        <w:jc w:val="center"/>
+        <w:tblLook w:firstColumn="1" w:firstRow="1" w:lastColumn="0" w:lastRow="0" w:noHBand="0" w:noVBand="1" w:val="04A0"/>
+      </w:tblPr>
+      <w:tblGrid>
+        <w:gridCol w:w="3118"/>
+        <w:gridCol w:w="3118"/>
+        <w:gridCol w:w="3118"/>
+      </w:tblGrid>
+      <w:tr>
+        <w:tc>
+          <w:tcPr>
+            <w:tcW w:type="dxa" w:w="3118"/>
+            <w:shd w:val="clear" w:fill="FFE8E1"/>
+          </w:tcPr>
+          <w:p>
+            <w:r>
+              <w:rPr>
+                <w:b/>
+                <w:sz w:val="21"/>
+              </w:rPr>
+            </w:r>
+            <w:r>
+              <w:rPr>
+                <w:b/>
+                <w:sz w:val="21"/>
+              </w:rPr>
+              <w:t>Khu vực</w:t>
+            </w:r>
+          </w:p>
+        </w:tc>
+        <w:tc>
+          <w:tcPr>
+            <w:tcW w:type="dxa" w:w="3118"/>
+            <w:shd w:val="clear" w:fill="FFE8E1"/>
+          </w:tcPr>
+          <w:p>
+            <w:r>
+              <w:rPr>
+                <w:b/>
+                <w:sz w:val="21"/>
+              </w:rPr>
+            </w:r>
+            <w:r>
+              <w:rPr>
+                <w:b/>
+                <w:sz w:val="21"/>
+              </w:rPr>
+              <w:t>Nguồn dữ liệu</w:t>
+            </w:r>
+          </w:p>
+        </w:tc>
+        <w:tc>
+          <w:tcPr>
+            <w:tcW w:type="dxa" w:w="3118"/>
+            <w:shd w:val="clear" w:fill="FFE8E1"/>
+          </w:tcPr>
+          <w:p>
+            <w:r>
+              <w:rPr>
+                <w:b/>
+                <w:sz w:val="21"/>
+              </w:rPr>
+            </w:r>
+            <w:r>
+              <w:rPr>
+                <w:b/>
+                <w:sz w:val="21"/>
+              </w:rPr>
+              <w:t>Nội dung</w:t>
+            </w:r>
+          </w:p>
+        </w:tc>
+      </w:tr>
+      <w:tr>
+        <w:tc>
+          <w:tcPr>
+            <w:tcW w:type="dxa" w:w="3118"/>
+          </w:tcPr>
+          <w:p>
+            <w:r>
+              <w:rPr>
+                <w:sz w:val="21"/>
+              </w:rPr>
+            </w:r>
+            <w:r>
+              <w:rPr>
+                <w:sz w:val="21"/>
+              </w:rPr>
+              <w:t>Trạng thái cụm</w:t>
+            </w:r>
+          </w:p>
+        </w:tc>
+        <w:tc>
+          <w:tcPr>
+            <w:tcW w:type="dxa" w:w="3118"/>
+          </w:tcPr>
+          <w:p>
+            <w:r>
+              <w:rPr>
+                <w:sz w:val="21"/>
+              </w:rPr>
+            </w:r>
+            <w:r>
+              <w:rPr>
+                <w:sz w:val="21"/>
+              </w:rPr>
+              <w:t>JMX của NameNode (</w:t>
+            </w:r>
+            <w:r>
+              <w:rPr>
+                <w:rFonts w:ascii="Consolas" w:hAnsi="Consolas"/>
+                <w:color w:val="EE4D2D"/>
+                <w:sz w:val="21"/>
+              </w:rPr>
+              <w:t>:9870/jmx</w:t>
+            </w:r>
+            <w:r>
+              <w:rPr>
+                <w:sz w:val="21"/>
+              </w:rPr>
+              <w:t>)</w:t>
+            </w:r>
+          </w:p>
+        </w:tc>
+        <w:tc>
+          <w:tcPr>
+            <w:tcW w:type="dxa" w:w="3118"/>
+          </w:tcPr>
+          <w:p>
+            <w:r>
+              <w:rPr>
+                <w:sz w:val="21"/>
+              </w:rPr>
+            </w:r>
+            <w:r>
+              <w:rPr>
+                <w:sz w:val="21"/>
+              </w:rPr>
+              <w:t>Số DataNode sống, tổng khối, tổng file, dung lượng đã dùng</w:t>
+            </w:r>
+          </w:p>
+        </w:tc>
+      </w:tr>
+      <w:tr>
+        <w:tc>
+          <w:tcPr>
+            <w:tcW w:type="dxa" w:w="3118"/>
+          </w:tcPr>
+          <w:p>
+            <w:r>
+              <w:rPr>
+                <w:sz w:val="21"/>
+              </w:rPr>
+            </w:r>
+            <w:r>
+              <w:rPr>
+                <w:sz w:val="21"/>
+              </w:rPr>
+              <w:t>Cây thư mục HDFS</w:t>
+            </w:r>
+          </w:p>
+        </w:tc>
+        <w:tc>
+          <w:tcPr>
+            <w:tcW w:type="dxa" w:w="3118"/>
+          </w:tcPr>
+          <w:p>
+            <w:r>
+              <w:rPr>
+                <w:sz w:val="21"/>
+              </w:rPr>
+            </w:r>
+            <w:r>
+              <w:rPr>
+                <w:sz w:val="21"/>
+              </w:rPr>
+              <w:t>WebHDFS REST API</w:t>
+            </w:r>
+          </w:p>
+        </w:tc>
+        <w:tc>
+          <w:tcPr>
+            <w:tcW w:type="dxa" w:w="3118"/>
+          </w:tcPr>
+          <w:p>
+            <w:r>
+              <w:rPr>
+                <w:sz w:val="21"/>
+              </w:rPr>
+            </w:r>
+            <w:r>
+              <w:rPr>
+                <w:sz w:val="21"/>
+              </w:rPr>
+              <w:t xml:space="preserve">Duyệt </w:t>
+            </w:r>
+            <w:r>
+              <w:rPr>
+                <w:rFonts w:ascii="Consolas" w:hAnsi="Consolas"/>
+                <w:color w:val="EE4D2D"/>
+                <w:sz w:val="21"/>
+              </w:rPr>
+              <w:t>/ecommerce</w:t>
+            </w:r>
+            <w:r>
+              <w:rPr>
+                <w:sz w:val="21"/>
+              </w:rPr>
+              <w:t xml:space="preserve">, thấy phân vùng </w:t>
+            </w:r>
+            <w:r>
+              <w:rPr>
+                <w:rFonts w:ascii="Consolas" w:hAnsi="Consolas"/>
+                <w:color w:val="EE4D2D"/>
+                <w:sz w:val="21"/>
+              </w:rPr>
+              <w:t>event_month=</w:t>
+            </w:r>
+            <w:r>
+              <w:rPr>
+                <w:sz w:val="21"/>
+              </w:rPr>
+              <w:t xml:space="preserve"> và hệ số nhân bản từng file</w:t>
+            </w:r>
+          </w:p>
+        </w:tc>
+      </w:tr>
+      <w:tr>
+        <w:tc>
+          <w:tcPr>
+            <w:tcW w:type="dxa" w:w="3118"/>
+          </w:tcPr>
+          <w:p>
+            <w:r>
+              <w:rPr>
+                <w:sz w:val="21"/>
+              </w:rPr>
+            </w:r>
+            <w:r>
+              <w:rPr>
+                <w:sz w:val="21"/>
+              </w:rPr>
+              <w:t>Kết quả Spark</w:t>
+            </w:r>
+          </w:p>
+        </w:tc>
+        <w:tc>
+          <w:tcPr>
+            <w:tcW w:type="dxa" w:w="3118"/>
+          </w:tcPr>
+          <w:p>
+            <w:r>
+              <w:rPr>
+                <w:sz w:val="21"/>
+              </w:rPr>
+            </w:r>
+            <w:r>
+              <w:rPr>
+                <w:sz w:val="21"/>
+              </w:rPr>
+              <w:t xml:space="preserve">Lớp </w:t>
+            </w:r>
+            <w:r>
+              <w:rPr>
+                <w:rFonts w:ascii="Consolas" w:hAnsi="Consolas"/>
+                <w:color w:val="EE4D2D"/>
+                <w:sz w:val="21"/>
+              </w:rPr>
+              <w:t>curated</w:t>
+            </w:r>
+            <w:r>
+              <w:rPr>
+                <w:sz w:val="21"/>
+              </w:rPr>
+              <w:t xml:space="preserve"> trên HDFS</w:t>
+            </w:r>
+          </w:p>
+        </w:tc>
+        <w:tc>
+          <w:tcPr>
+            <w:tcW w:type="dxa" w:w="3118"/>
+          </w:tcPr>
+          <w:p>
+            <w:r>
+              <w:rPr>
+                <w:sz w:val="21"/>
+              </w:rPr>
+            </w:r>
+            <w:r>
+              <w:rPr>
+                <w:sz w:val="21"/>
+              </w:rPr>
+              <w:t>Sáu bảng kết quả kèm biểu đồ tương ứng</w:t>
+            </w:r>
+          </w:p>
+        </w:tc>
+      </w:tr>
+    </w:tbl>
+    <w:p/>
+    <w:p>
+      <w:pPr>
+        <w:jc w:val="both"/>
+      </w:pPr>
+      <w:r>
+        <w:t xml:space="preserve">Biểu đồ </w:t>
+      </w:r>
+      <w:r>
+        <w:rPr>
+          <w:i/>
+        </w:rPr>
+        <w:t>Hiệu suất vận chuyển</w:t>
+      </w:r>
+      <w:r>
+        <w:t xml:space="preserve"> đặt cạnh nhau hai cột: số ngày giao (từ PostgreSQL) và số trạm trung chuyển (từ MongoDB). Hai cột tăng cùng chiều qua cả năm hãng — hình ảnh này minh họa trực tiếp giá trị của việc gộp hai nguồn dữ liệu.</w:t>
       </w:r>
     </w:p>
     <w:p>

</xml_diff>